<commit_message>
feat: portfolio editorial redesign with contact form and light mode fixes
</commit_message>
<xml_diff>
--- a/public/resume/Vikash-Kumar-Resume.docx
+++ b/public/resume/Vikash-Kumar-Resume.docx
@@ -88,16 +88,9 @@
             <w:sz w:val="20"/>
             <w:szCs w:val="20"/>
           </w:rPr>
-          <w:t>Gmail</w:t>
+          <w:t>vikashkumarsudhi8527@gmail.com</w:t>
         </w:r>
       </w:hyperlink>
-      <w:r>
-        <w:rPr>
-          <w:sz w:val="20"/>
-          <w:szCs w:val="20"/>
-        </w:rPr>
-        <w:t xml:space="preserve"> </w:t>
-      </w:r>
       <w:r>
         <w:rPr>
           <w:sz w:val="20"/>
@@ -119,16 +112,9 @@
             <w:sz w:val="20"/>
             <w:szCs w:val="20"/>
           </w:rPr>
-          <w:t>GitHub</w:t>
+          <w:t>https://github.com/Vikash-Kumar001/</w:t>
         </w:r>
       </w:hyperlink>
-      <w:r>
-        <w:rPr>
-          <w:sz w:val="20"/>
-          <w:szCs w:val="20"/>
-        </w:rPr>
-        <w:t xml:space="preserve"> </w:t>
-      </w:r>
       <w:r>
         <w:rPr>
           <w:sz w:val="20"/>
@@ -150,7 +136,7 @@
             <w:sz w:val="20"/>
             <w:szCs w:val="20"/>
           </w:rPr>
-          <w:t>LinkedIn</w:t>
+          <w:t>https://www.linkedin.com/in/vikash-kumar-2068b9219/</w:t>
         </w:r>
       </w:hyperlink>
       <w:r>
@@ -158,21 +144,7 @@
           <w:sz w:val="20"/>
           <w:szCs w:val="20"/>
         </w:rPr>
-        <w:t xml:space="preserve"> </w:t>
-      </w:r>
-      <w:r>
-        <w:rPr>
-          <w:sz w:val="20"/>
-          <w:szCs w:val="20"/>
-        </w:rPr>
         <w:t>|</w:t>
-      </w:r>
-      <w:r>
-        <w:rPr>
-          <w:sz w:val="20"/>
-          <w:szCs w:val="20"/>
-        </w:rPr>
-        <w:t xml:space="preserve"> </w:t>
       </w:r>
       <w:hyperlink r:id="rId9" w:history="1">
         <w:r>
@@ -181,15 +153,7 @@
             <w:sz w:val="20"/>
             <w:szCs w:val="20"/>
           </w:rPr>
-          <w:t>Portfo</w:t>
-        </w:r>
-        <w:r>
-          <w:rPr>
-            <w:rStyle w:val="Hyperlink"/>
-            <w:sz w:val="20"/>
-            <w:szCs w:val="20"/>
-          </w:rPr>
-          <w:t>lio</w:t>
+          <w:t>https://vikash-dotdev.vercel.app/</w:t>
         </w:r>
       </w:hyperlink>
     </w:p>
@@ -205,7 +169,7 @@
       </w:pPr>
       <w:r>
         <w:pict w14:anchorId="0025E2B0">
-          <v:rect id="_x0000_i1025" style="width:0;height:1.5pt" o:hralign="center" o:hrstd="t" o:hr="t" fillcolor="#a0a0a0" stroked="f"/>
+          <v:rect id="_x0000_i1029" style="width:0;height:1.5pt" o:hralign="center" o:hrstd="t" o:hr="t" fillcolor="#a0a0a0" stroked="f"/>
         </w:pict>
       </w:r>
     </w:p>
@@ -215,16 +179,16 @@
         <w:rPr>
           <w:b/>
           <w:bCs/>
-          <w:sz w:val="20"/>
-          <w:szCs w:val="20"/>
-        </w:rPr>
-      </w:pPr>
-      <w:r>
-        <w:rPr>
-          <w:b/>
-          <w:bCs/>
-          <w:sz w:val="20"/>
-          <w:szCs w:val="20"/>
+          <w:sz w:val="22"/>
+          <w:szCs w:val="22"/>
+        </w:rPr>
+      </w:pPr>
+      <w:r>
+        <w:rPr>
+          <w:b/>
+          <w:bCs/>
+          <w:sz w:val="22"/>
+          <w:szCs w:val="22"/>
         </w:rPr>
         <w:t>PROFESSIONAL SUMMARY</w:t>
       </w:r>
@@ -233,16 +197,44 @@
       <w:pPr>
         <w:spacing w:after="0" w:line="240" w:lineRule="auto"/>
         <w:rPr>
-          <w:sz w:val="18"/>
-          <w:szCs w:val="18"/>
-        </w:rPr>
-      </w:pPr>
-      <w:r>
-        <w:rPr>
-          <w:sz w:val="18"/>
-          <w:szCs w:val="18"/>
-        </w:rPr>
-        <w:t>Full Stack Web Developer skilled in React.js and Node.js, focused on building secure APIs and scalable applications. I enjoy solving challenging problems, designing clean architectures, and working with teams to ship reliable products.</w:t>
+          <w:sz w:val="20"/>
+          <w:szCs w:val="20"/>
+        </w:rPr>
+      </w:pPr>
+      <w:r>
+        <w:rPr>
+          <w:sz w:val="20"/>
+          <w:szCs w:val="20"/>
+        </w:rPr>
+        <w:t>Full-Stack Developer with 1 year of experience building production-grade SaaS applications. Skilled in React.js, Node.js,</w:t>
+      </w:r>
+      <w:r>
+        <w:rPr>
+          <w:sz w:val="20"/>
+          <w:szCs w:val="20"/>
+        </w:rPr>
+        <w:t xml:space="preserve"> </w:t>
+      </w:r>
+      <w:r>
+        <w:rPr>
+          <w:sz w:val="20"/>
+          <w:szCs w:val="20"/>
+        </w:rPr>
+        <w:t xml:space="preserve">MongoDB, </w:t>
+      </w:r>
+      <w:r>
+        <w:rPr>
+          <w:sz w:val="20"/>
+          <w:szCs w:val="20"/>
+        </w:rPr>
+        <w:t xml:space="preserve">PM2, </w:t>
+      </w:r>
+      <w:r>
+        <w:rPr>
+          <w:sz w:val="20"/>
+          <w:szCs w:val="20"/>
+        </w:rPr>
+        <w:t>PostgreSQL, AWS, REST APIs, Socket.IO, multi-tenant systems, and payment integrations.</w:t>
       </w:r>
     </w:p>
     <w:p>
@@ -260,16 +252,16 @@
         <w:rPr>
           <w:b/>
           <w:bCs/>
-          <w:sz w:val="20"/>
-          <w:szCs w:val="20"/>
-        </w:rPr>
-      </w:pPr>
-      <w:r>
-        <w:rPr>
-          <w:b/>
-          <w:bCs/>
-          <w:sz w:val="20"/>
-          <w:szCs w:val="20"/>
+          <w:sz w:val="22"/>
+          <w:szCs w:val="22"/>
+        </w:rPr>
+      </w:pPr>
+      <w:r>
+        <w:rPr>
+          <w:b/>
+          <w:bCs/>
+          <w:sz w:val="22"/>
+          <w:szCs w:val="22"/>
         </w:rPr>
         <w:t>TECHNICAL SKILLS</w:t>
       </w:r>
@@ -308,56 +300,7 @@
           <w:sz w:val="18"/>
           <w:szCs w:val="18"/>
         </w:rPr>
-        <w:t xml:space="preserve">HTML5, CSS3, JavaScript, React.js, </w:t>
-      </w:r>
-      <w:r>
-        <w:rPr>
-          <w:sz w:val="18"/>
-          <w:szCs w:val="18"/>
-        </w:rPr>
-        <w:t xml:space="preserve">React Router, </w:t>
-      </w:r>
-      <w:r>
-        <w:rPr>
-          <w:sz w:val="18"/>
-          <w:szCs w:val="18"/>
-        </w:rPr>
-        <w:t>Tailwind CSS,</w:t>
-      </w:r>
-      <w:r>
-        <w:rPr>
-          <w:sz w:val="18"/>
-          <w:szCs w:val="18"/>
-        </w:rPr>
-        <w:t xml:space="preserve"> </w:t>
-      </w:r>
-      <w:r>
-        <w:rPr>
-          <w:sz w:val="18"/>
-          <w:szCs w:val="18"/>
-        </w:rPr>
-        <w:t>Three.js,</w:t>
-      </w:r>
-      <w:r>
-        <w:rPr>
-          <w:sz w:val="18"/>
-          <w:szCs w:val="18"/>
-        </w:rPr>
-        <w:t xml:space="preserve"> </w:t>
-      </w:r>
-      <w:r>
-        <w:rPr>
-          <w:sz w:val="18"/>
-          <w:szCs w:val="18"/>
-        </w:rPr>
-        <w:t>Framer Motion</w:t>
-      </w:r>
-      <w:r>
-        <w:rPr>
-          <w:sz w:val="18"/>
-          <w:szCs w:val="18"/>
-        </w:rPr>
-        <w:t>, Chart.js, Recharts</w:t>
+        <w:t>React.js, Next.js, JavaScript (ES6+), Tailwind CSS, Framer Motion, Three.js, Chart.js, Recharts, React Router</w:t>
       </w:r>
     </w:p>
     <w:p>
@@ -394,14 +337,21 @@
           <w:sz w:val="18"/>
           <w:szCs w:val="18"/>
         </w:rPr>
-        <w:t>Node.js, and Express.js</w:t>
-      </w:r>
-      <w:r>
-        <w:rPr>
-          <w:sz w:val="18"/>
-          <w:szCs w:val="18"/>
-        </w:rPr>
-        <w:t>, Rest API’s, Flask, Socket.io</w:t>
+        <w:t xml:space="preserve">Node.js, Express.js, Flask, Socket.io, REST APIs, </w:t>
+      </w:r>
+      <w:r>
+        <w:rPr>
+          <w:sz w:val="18"/>
+          <w:szCs w:val="18"/>
+        </w:rPr>
+        <w:t>WebSocket</w:t>
+      </w:r>
+      <w:r>
+        <w:rPr>
+          <w:sz w:val="18"/>
+          <w:szCs w:val="18"/>
+        </w:rPr>
+        <w:t>, Real-Time Systems, Multi-Tenant Architecture</w:t>
       </w:r>
     </w:p>
     <w:p>
@@ -438,7 +388,14 @@
           <w:sz w:val="18"/>
           <w:szCs w:val="18"/>
         </w:rPr>
-        <w:t>MySQL, SQL, PostgreSQL, Firebase, MongoDB, MongoDB Atlas, and Supabase</w:t>
+        <w:t>MongoDB, PostgreSQL, MySQL, Firebase, Supabase</w:t>
+      </w:r>
+      <w:r>
+        <w:rPr>
+          <w:sz w:val="18"/>
+          <w:szCs w:val="18"/>
+        </w:rPr>
+        <w:t>, Neon</w:t>
       </w:r>
     </w:p>
     <w:p>
@@ -461,14 +418,37 @@
           <w:sz w:val="18"/>
           <w:szCs w:val="18"/>
         </w:rPr>
-        <w:t>Payment:</w:t>
-      </w:r>
-      <w:r>
-        <w:rPr>
-          <w:sz w:val="20"/>
-          <w:szCs w:val="20"/>
-        </w:rPr>
-        <w:t xml:space="preserve"> Razorpay, Stripe</w:t>
+        <w:t>Cloud &amp; Infra</w:t>
+      </w:r>
+      <w:r>
+        <w:rPr>
+          <w:b/>
+          <w:bCs/>
+          <w:sz w:val="18"/>
+          <w:szCs w:val="18"/>
+        </w:rPr>
+        <w:t>:</w:t>
+      </w:r>
+      <w:r>
+        <w:rPr>
+          <w:sz w:val="18"/>
+          <w:szCs w:val="18"/>
+        </w:rPr>
+        <w:t xml:space="preserve"> </w:t>
+      </w:r>
+      <w:r>
+        <w:rPr>
+          <w:sz w:val="20"/>
+          <w:szCs w:val="20"/>
+        </w:rPr>
+        <w:t xml:space="preserve"> </w:t>
+      </w:r>
+      <w:r>
+        <w:rPr>
+          <w:sz w:val="20"/>
+          <w:szCs w:val="20"/>
+        </w:rPr>
+        <w:t>AWS EC2, AWS S3, Nginx, PM2, Vercel, Render</w:t>
       </w:r>
     </w:p>
     <w:p>
@@ -491,28 +471,30 @@
           <w:sz w:val="18"/>
           <w:szCs w:val="18"/>
         </w:rPr>
-        <w:t>Languages:</w:t>
-      </w:r>
-      <w:r>
-        <w:rPr>
-          <w:sz w:val="18"/>
-          <w:szCs w:val="18"/>
-        </w:rPr>
-        <w:t xml:space="preserve"> C, C++, Python, </w:t>
-      </w:r>
-      <w:r>
-        <w:rPr>
-          <w:sz w:val="18"/>
-          <w:szCs w:val="18"/>
-        </w:rPr>
-        <w:t xml:space="preserve">and </w:t>
-      </w:r>
-      <w:r>
-        <w:rPr>
-          <w:sz w:val="18"/>
-          <w:szCs w:val="18"/>
-        </w:rPr>
-        <w:t>Java</w:t>
+        <w:t xml:space="preserve">Auth &amp; </w:t>
+      </w:r>
+      <w:r>
+        <w:rPr>
+          <w:b/>
+          <w:bCs/>
+          <w:sz w:val="18"/>
+          <w:szCs w:val="18"/>
+        </w:rPr>
+        <w:t>Payment:</w:t>
+      </w:r>
+      <w:r>
+        <w:rPr>
+          <w:sz w:val="20"/>
+          <w:szCs w:val="20"/>
+        </w:rPr>
+        <w:t xml:space="preserve"> </w:t>
+      </w:r>
+      <w:r>
+        <w:rPr>
+          <w:sz w:val="20"/>
+          <w:szCs w:val="20"/>
+        </w:rPr>
+        <w:t>JWT, Google OAuth, Bcrypt, Razorpay, Stripe, Nodemailer</w:t>
       </w:r>
     </w:p>
     <w:p>
@@ -544,16 +526,16 @@
           <w:sz w:val="18"/>
           <w:szCs w:val="18"/>
         </w:rPr>
-        <w:t>&amp; Auth</w:t>
-      </w:r>
-      <w:r>
-        <w:rPr>
-          <w:b/>
-          <w:bCs/>
-          <w:sz w:val="18"/>
-          <w:szCs w:val="18"/>
-        </w:rPr>
-        <w:t>:</w:t>
+        <w:t xml:space="preserve">&amp; </w:t>
+      </w:r>
+      <w:r>
+        <w:rPr>
+          <w:b/>
+          <w:bCs/>
+          <w:sz w:val="18"/>
+          <w:szCs w:val="18"/>
+        </w:rPr>
+        <w:t>Languages:</w:t>
       </w:r>
       <w:r>
         <w:rPr>
@@ -567,35 +549,7 @@
           <w:sz w:val="18"/>
           <w:szCs w:val="18"/>
         </w:rPr>
-        <w:t xml:space="preserve">JWT, </w:t>
-      </w:r>
-      <w:r>
-        <w:rPr>
-          <w:sz w:val="18"/>
-          <w:szCs w:val="18"/>
-        </w:rPr>
-        <w:t xml:space="preserve">OAuth, </w:t>
-      </w:r>
-      <w:r>
-        <w:rPr>
-          <w:sz w:val="18"/>
-          <w:szCs w:val="18"/>
-        </w:rPr>
-        <w:t>Bcrypt</w:t>
-      </w:r>
-      <w:r>
-        <w:rPr>
-          <w:sz w:val="18"/>
-          <w:szCs w:val="18"/>
-        </w:rPr>
-        <w:t xml:space="preserve">, </w:t>
-      </w:r>
-      <w:r>
-        <w:rPr>
-          <w:sz w:val="18"/>
-          <w:szCs w:val="18"/>
-        </w:rPr>
-        <w:t>Git, GitHub, Postman, Nodemailer, Notion, Canva, Microsoft Office</w:t>
+        <w:t>Git, GitHub, Postman, Python, C++, Java</w:t>
       </w:r>
     </w:p>
     <w:p>
@@ -618,44 +572,30 @@
           <w:sz w:val="18"/>
           <w:szCs w:val="18"/>
         </w:rPr>
-        <w:t>Others:</w:t>
-      </w:r>
-      <w:r>
-        <w:rPr>
-          <w:sz w:val="20"/>
-          <w:szCs w:val="20"/>
-        </w:rPr>
-        <w:t xml:space="preserve"> Real-time systems, Data modelling, </w:t>
-      </w:r>
-      <w:proofErr w:type="gramStart"/>
-      <w:r>
-        <w:rPr>
-          <w:sz w:val="20"/>
-          <w:szCs w:val="20"/>
-        </w:rPr>
-        <w:t>Multi-</w:t>
-      </w:r>
-      <w:r>
-        <w:rPr>
-          <w:sz w:val="20"/>
-          <w:szCs w:val="20"/>
-        </w:rPr>
-        <w:t>T</w:t>
-      </w:r>
-      <w:r>
-        <w:rPr>
-          <w:sz w:val="20"/>
-          <w:szCs w:val="20"/>
-        </w:rPr>
-        <w:t>enant</w:t>
-      </w:r>
-      <w:proofErr w:type="gramEnd"/>
-      <w:r>
-        <w:rPr>
-          <w:sz w:val="20"/>
-          <w:szCs w:val="20"/>
-        </w:rPr>
-        <w:t xml:space="preserve"> architecture</w:t>
+        <w:t>Concepts</w:t>
+      </w:r>
+      <w:r>
+        <w:rPr>
+          <w:b/>
+          <w:bCs/>
+          <w:sz w:val="18"/>
+          <w:szCs w:val="18"/>
+        </w:rPr>
+        <w:t>:</w:t>
+      </w:r>
+      <w:r>
+        <w:rPr>
+          <w:sz w:val="20"/>
+          <w:szCs w:val="20"/>
+        </w:rPr>
+        <w:t xml:space="preserve"> </w:t>
+      </w:r>
+      <w:r>
+        <w:rPr>
+          <w:sz w:val="20"/>
+          <w:szCs w:val="20"/>
+        </w:rPr>
+        <w:t>Data Modelling, Multi-Tenant SaaS, Event-Driven Architecture, RBAC, Agile</w:t>
       </w:r>
     </w:p>
     <w:p>
@@ -675,16 +615,16 @@
         <w:rPr>
           <w:b/>
           <w:bCs/>
-          <w:sz w:val="18"/>
-          <w:szCs w:val="18"/>
-        </w:rPr>
-      </w:pPr>
-      <w:r>
-        <w:rPr>
-          <w:b/>
-          <w:bCs/>
-          <w:sz w:val="20"/>
-          <w:szCs w:val="20"/>
+          <w:sz w:val="22"/>
+          <w:szCs w:val="22"/>
+        </w:rPr>
+      </w:pPr>
+      <w:r>
+        <w:rPr>
+          <w:b/>
+          <w:bCs/>
+          <w:sz w:val="22"/>
+          <w:szCs w:val="22"/>
         </w:rPr>
         <w:t>WORK EXPERIENCE</w:t>
       </w:r>
@@ -693,20 +633,39 @@
       <w:pPr>
         <w:spacing w:after="0" w:line="240" w:lineRule="auto"/>
         <w:rPr>
-          <w:rStyle w:val="Strong"/>
+          <w:b/>
+          <w:bCs/>
+          <w:sz w:val="18"/>
+          <w:szCs w:val="18"/>
+        </w:rPr>
+      </w:pPr>
+    </w:p>
+    <w:p>
+      <w:pPr>
+        <w:spacing w:after="0" w:line="240" w:lineRule="auto"/>
+        <w:rPr>
           <w:rFonts w:cstheme="minorHAnsi"/>
-          <w:b w:val="0"/>
-          <w:bCs w:val="0"/>
-          <w:sz w:val="18"/>
-          <w:szCs w:val="18"/>
-        </w:rPr>
-      </w:pPr>
-      <w:r>
-        <w:rPr>
-          <w:sz w:val="20"/>
-          <w:szCs w:val="20"/>
-        </w:rPr>
-        <w:t xml:space="preserve">Full-Stack Intern </w:t>
+          <w:b/>
+          <w:bCs/>
+          <w:i/>
+          <w:iCs/>
+          <w:sz w:val="20"/>
+          <w:szCs w:val="20"/>
+        </w:rPr>
+      </w:pPr>
+      <w:r>
+        <w:rPr>
+          <w:sz w:val="20"/>
+          <w:szCs w:val="20"/>
+        </w:rPr>
+        <w:t>Full-Stack Developer</w:t>
+      </w:r>
+      <w:r>
+        <w:rPr>
+          <w:sz w:val="20"/>
+          <w:szCs w:val="20"/>
+        </w:rPr>
+        <w:t xml:space="preserve"> </w:t>
       </w:r>
       <w:r>
         <w:rPr>
@@ -794,28 +753,28 @@
           <w:szCs w:val="20"/>
         </w:rPr>
         <w:tab/>
-      </w:r>
-      <w:r>
-        <w:rPr>
-          <w:rFonts w:cstheme="minorHAnsi"/>
-          <w:sz w:val="20"/>
-          <w:szCs w:val="20"/>
-        </w:rPr>
-        <w:t xml:space="preserve">       </w:t>
       </w:r>
       <w:r>
         <w:rPr>
           <w:rStyle w:val="Emphasis"/>
           <w:rFonts w:cstheme="minorHAnsi"/>
-          <w:sz w:val="20"/>
-          <w:szCs w:val="20"/>
-        </w:rPr>
-        <w:t>Sep</w:t>
+          <w:b/>
+          <w:bCs/>
+          <w:i w:val="0"/>
+          <w:iCs w:val="0"/>
+          <w:sz w:val="20"/>
+          <w:szCs w:val="20"/>
+        </w:rPr>
+        <w:t>Jun</w:t>
       </w:r>
       <w:r>
         <w:rPr>
           <w:rStyle w:val="Emphasis"/>
           <w:rFonts w:cstheme="minorHAnsi"/>
+          <w:b/>
+          <w:bCs/>
+          <w:i w:val="0"/>
+          <w:iCs w:val="0"/>
           <w:sz w:val="20"/>
           <w:szCs w:val="20"/>
         </w:rPr>
@@ -825,104 +784,178 @@
         <w:rPr>
           <w:rStyle w:val="Emphasis"/>
           <w:rFonts w:cstheme="minorHAnsi"/>
-          <w:sz w:val="20"/>
-          <w:szCs w:val="20"/>
-        </w:rPr>
-        <w:t>Present</w:t>
-      </w:r>
-      <w:r>
-        <w:rPr>
-          <w:rFonts w:cstheme="minorHAnsi"/>
-          <w:sz w:val="20"/>
-          <w:szCs w:val="20"/>
-        </w:rPr>
-        <w:br/>
-      </w:r>
-      <w:r>
-        <w:rPr>
-          <w:rStyle w:val="Strong"/>
-          <w:rFonts w:cstheme="minorHAnsi"/>
-          <w:b w:val="0"/>
-          <w:bCs w:val="0"/>
-          <w:sz w:val="18"/>
-          <w:szCs w:val="18"/>
-        </w:rPr>
-        <w:t xml:space="preserve">Worked on two major products: </w:t>
-      </w:r>
-      <w:r>
-        <w:rPr>
-          <w:rStyle w:val="Strong"/>
-          <w:rFonts w:cstheme="minorHAnsi"/>
-          <w:sz w:val="18"/>
-          <w:szCs w:val="18"/>
-        </w:rPr>
-        <w:t>Wise Student</w:t>
-      </w:r>
-      <w:r>
-        <w:rPr>
-          <w:rStyle w:val="Strong"/>
-          <w:rFonts w:cstheme="minorHAnsi"/>
-          <w:b w:val="0"/>
-          <w:bCs w:val="0"/>
-          <w:sz w:val="18"/>
-          <w:szCs w:val="18"/>
-        </w:rPr>
-        <w:t xml:space="preserve"> (AI wellness &amp; finance platform) and </w:t>
-      </w:r>
-      <w:r>
-        <w:rPr>
-          <w:rStyle w:val="Strong"/>
-          <w:rFonts w:cstheme="minorHAnsi"/>
-          <w:sz w:val="18"/>
-          <w:szCs w:val="18"/>
-        </w:rPr>
-        <w:t>Inavora</w:t>
-      </w:r>
-      <w:r>
-        <w:rPr>
-          <w:rStyle w:val="Strong"/>
-          <w:rFonts w:cstheme="minorHAnsi"/>
-          <w:b w:val="0"/>
-          <w:bCs w:val="0"/>
-          <w:sz w:val="18"/>
-          <w:szCs w:val="18"/>
-        </w:rPr>
-        <w:t xml:space="preserve"> (real-time interactive presentation system).</w:t>
+          <w:b/>
+          <w:bCs/>
+          <w:i w:val="0"/>
+          <w:iCs w:val="0"/>
+          <w:sz w:val="20"/>
+          <w:szCs w:val="20"/>
+        </w:rPr>
+        <w:t>Jun 2026</w:t>
       </w:r>
     </w:p>
     <w:p>
       <w:pPr>
         <w:spacing w:after="0" w:line="240" w:lineRule="auto"/>
         <w:rPr>
-          <w:rStyle w:val="Strong"/>
-          <w:rFonts w:cstheme="minorHAnsi"/>
-          <w:b w:val="0"/>
-          <w:bCs w:val="0"/>
-          <w:sz w:val="18"/>
-          <w:szCs w:val="18"/>
-        </w:rPr>
-      </w:pPr>
-      <w:hyperlink r:id="rId10" w:history="1">
-        <w:r>
-          <w:rPr>
-            <w:rStyle w:val="Hyperlink"/>
-            <w:rFonts w:cstheme="minorHAnsi"/>
-            <w:b/>
-            <w:bCs/>
-            <w:sz w:val="18"/>
-            <w:szCs w:val="18"/>
-          </w:rPr>
-          <w:t>Wise Student</w:t>
-        </w:r>
-      </w:hyperlink>
-      <w:r>
-        <w:rPr>
-          <w:rStyle w:val="Strong"/>
-          <w:rFonts w:cstheme="minorHAnsi"/>
-          <w:sz w:val="18"/>
-          <w:szCs w:val="18"/>
-        </w:rPr>
-        <w:t>:</w:t>
+          <w:b/>
+          <w:bCs/>
+          <w:sz w:val="18"/>
+          <w:szCs w:val="18"/>
+        </w:rPr>
+      </w:pPr>
+      <w:r>
+        <w:rPr>
+          <w:b/>
+          <w:bCs/>
+          <w:sz w:val="18"/>
+          <w:szCs w:val="18"/>
+        </w:rPr>
+        <w:t xml:space="preserve">Tech stack: </w:t>
+      </w:r>
+      <w:r>
+        <w:rPr>
+          <w:b/>
+          <w:bCs/>
+          <w:sz w:val="18"/>
+          <w:szCs w:val="18"/>
+        </w:rPr>
+        <w:t>Node.js</w:t>
+      </w:r>
+      <w:r>
+        <w:rPr>
+          <w:b/>
+          <w:bCs/>
+          <w:sz w:val="18"/>
+          <w:szCs w:val="18"/>
+        </w:rPr>
+        <w:t xml:space="preserve">, </w:t>
+      </w:r>
+      <w:r>
+        <w:rPr>
+          <w:b/>
+          <w:bCs/>
+          <w:sz w:val="18"/>
+          <w:szCs w:val="18"/>
+        </w:rPr>
+        <w:t>Express.js</w:t>
+      </w:r>
+      <w:r>
+        <w:rPr>
+          <w:b/>
+          <w:bCs/>
+          <w:sz w:val="18"/>
+          <w:szCs w:val="18"/>
+        </w:rPr>
+        <w:t xml:space="preserve">, </w:t>
+      </w:r>
+      <w:r>
+        <w:rPr>
+          <w:b/>
+          <w:bCs/>
+          <w:sz w:val="18"/>
+          <w:szCs w:val="18"/>
+        </w:rPr>
+        <w:t>MongoDB</w:t>
+      </w:r>
+      <w:r>
+        <w:rPr>
+          <w:b/>
+          <w:bCs/>
+          <w:sz w:val="18"/>
+          <w:szCs w:val="18"/>
+        </w:rPr>
+        <w:t xml:space="preserve">, </w:t>
+      </w:r>
+      <w:r>
+        <w:rPr>
+          <w:b/>
+          <w:bCs/>
+          <w:sz w:val="18"/>
+          <w:szCs w:val="18"/>
+        </w:rPr>
+        <w:t>Razorpay</w:t>
+      </w:r>
+      <w:r>
+        <w:rPr>
+          <w:b/>
+          <w:bCs/>
+          <w:sz w:val="18"/>
+          <w:szCs w:val="18"/>
+        </w:rPr>
+        <w:t xml:space="preserve">, </w:t>
+      </w:r>
+      <w:r>
+        <w:rPr>
+          <w:b/>
+          <w:bCs/>
+          <w:sz w:val="18"/>
+          <w:szCs w:val="18"/>
+        </w:rPr>
+        <w:t>AWS EC2</w:t>
+      </w:r>
+      <w:r>
+        <w:rPr>
+          <w:b/>
+          <w:bCs/>
+          <w:sz w:val="18"/>
+          <w:szCs w:val="18"/>
+        </w:rPr>
+        <w:t xml:space="preserve">, </w:t>
+      </w:r>
+      <w:r>
+        <w:rPr>
+          <w:b/>
+          <w:bCs/>
+          <w:sz w:val="18"/>
+          <w:szCs w:val="18"/>
+        </w:rPr>
+        <w:t>NGINX</w:t>
+      </w:r>
+      <w:r>
+        <w:rPr>
+          <w:b/>
+          <w:bCs/>
+          <w:sz w:val="18"/>
+          <w:szCs w:val="18"/>
+        </w:rPr>
+        <w:t xml:space="preserve">, </w:t>
+      </w:r>
+      <w:r>
+        <w:rPr>
+          <w:b/>
+          <w:bCs/>
+          <w:sz w:val="18"/>
+          <w:szCs w:val="18"/>
+        </w:rPr>
+        <w:t>PM</w:t>
+      </w:r>
+      <w:proofErr w:type="gramStart"/>
+      <w:r>
+        <w:rPr>
+          <w:b/>
+          <w:bCs/>
+          <w:sz w:val="18"/>
+          <w:szCs w:val="18"/>
+        </w:rPr>
+        <w:t>2,RestAPI</w:t>
+      </w:r>
+      <w:proofErr w:type="gramEnd"/>
+      <w:r>
+        <w:rPr>
+          <w:b/>
+          <w:bCs/>
+          <w:sz w:val="18"/>
+          <w:szCs w:val="18"/>
+        </w:rPr>
+        <w:t>, React.js, Tailwind CSS, and Lucide React Icons</w:t>
+      </w:r>
+      <w:r>
+        <w:rPr>
+          <w:sz w:val="18"/>
+          <w:szCs w:val="18"/>
+        </w:rPr>
+        <w:t>.</w:t>
       </w:r>
     </w:p>
     <w:p>
@@ -945,7 +978,61 @@
           <w:sz w:val="18"/>
           <w:szCs w:val="18"/>
         </w:rPr>
-        <w:t>Built full-stack features using React, Node.js, Express, MongoDB</w:t>
+        <w:t xml:space="preserve">Led full-stack development of </w:t>
+      </w:r>
+      <w:r>
+        <w:rPr>
+          <w:rFonts w:asciiTheme="minorHAnsi" w:hAnsiTheme="minorHAnsi" w:cstheme="minorHAnsi"/>
+          <w:b/>
+          <w:bCs/>
+          <w:sz w:val="18"/>
+          <w:szCs w:val="18"/>
+        </w:rPr>
+        <w:t>Inavora</w:t>
+      </w:r>
+      <w:r>
+        <w:rPr>
+          <w:rFonts w:asciiTheme="minorHAnsi" w:hAnsiTheme="minorHAnsi" w:cstheme="minorHAnsi"/>
+          <w:sz w:val="18"/>
+          <w:szCs w:val="18"/>
+        </w:rPr>
+        <w:t xml:space="preserve"> (real-time presentation SaaS) and </w:t>
+      </w:r>
+      <w:r>
+        <w:rPr>
+          <w:rFonts w:asciiTheme="minorHAnsi" w:hAnsiTheme="minorHAnsi" w:cstheme="minorHAnsi"/>
+          <w:b/>
+          <w:bCs/>
+          <w:sz w:val="18"/>
+          <w:szCs w:val="18"/>
+        </w:rPr>
+        <w:t>Wise Student</w:t>
+      </w:r>
+      <w:r>
+        <w:rPr>
+          <w:rFonts w:asciiTheme="minorHAnsi" w:hAnsiTheme="minorHAnsi" w:cstheme="minorHAnsi"/>
+          <w:sz w:val="18"/>
+          <w:szCs w:val="18"/>
+        </w:rPr>
+        <w:t xml:space="preserve"> (gamified EdTech platform) at Magorix, contributing </w:t>
+      </w:r>
+      <w:r>
+        <w:rPr>
+          <w:rFonts w:asciiTheme="minorHAnsi" w:hAnsiTheme="minorHAnsi" w:cstheme="minorHAnsi"/>
+          <w:b/>
+          <w:bCs/>
+          <w:sz w:val="18"/>
+          <w:szCs w:val="18"/>
+        </w:rPr>
+        <w:t>~70%</w:t>
+      </w:r>
+      <w:r>
+        <w:rPr>
+          <w:rFonts w:asciiTheme="minorHAnsi" w:hAnsiTheme="minorHAnsi" w:cstheme="minorHAnsi"/>
+          <w:sz w:val="18"/>
+          <w:szCs w:val="18"/>
+        </w:rPr>
+        <w:t xml:space="preserve"> of engineering and leading the development team.</w:t>
       </w:r>
     </w:p>
     <w:p>
@@ -968,15 +1055,61 @@
           <w:sz w:val="18"/>
           <w:szCs w:val="18"/>
         </w:rPr>
-        <w:t>Implemented real-time updates (Socket.IO) for chat, CBT, leaderboards, notifications</w:t>
+        <w:t xml:space="preserve">Built and shipped production features across both platforms — multi-tenant architecture, real-time </w:t>
       </w:r>
       <w:r>
         <w:rPr>
           <w:rFonts w:asciiTheme="minorHAnsi" w:hAnsiTheme="minorHAnsi" w:cstheme="minorHAnsi"/>
-          <w:sz w:val="18"/>
-          <w:szCs w:val="18"/>
-        </w:rPr>
-        <w:t xml:space="preserve"> </w:t>
+          <w:b/>
+          <w:bCs/>
+          <w:sz w:val="18"/>
+          <w:szCs w:val="18"/>
+        </w:rPr>
+        <w:t>Socket.IO</w:t>
+      </w:r>
+      <w:r>
+        <w:rPr>
+          <w:rFonts w:asciiTheme="minorHAnsi" w:hAnsiTheme="minorHAnsi" w:cstheme="minorHAnsi"/>
+          <w:sz w:val="18"/>
+          <w:szCs w:val="18"/>
+        </w:rPr>
+        <w:t xml:space="preserve"> systems, </w:t>
+      </w:r>
+      <w:r>
+        <w:rPr>
+          <w:rFonts w:asciiTheme="minorHAnsi" w:hAnsiTheme="minorHAnsi" w:cstheme="minorHAnsi"/>
+          <w:b/>
+          <w:bCs/>
+          <w:sz w:val="18"/>
+          <w:szCs w:val="18"/>
+        </w:rPr>
+        <w:t>REST APIs</w:t>
+      </w:r>
+      <w:r>
+        <w:rPr>
+          <w:rFonts w:asciiTheme="minorHAnsi" w:hAnsiTheme="minorHAnsi" w:cstheme="minorHAnsi"/>
+          <w:sz w:val="18"/>
+          <w:szCs w:val="18"/>
+        </w:rPr>
+        <w:t xml:space="preserve">, and </w:t>
+      </w:r>
+      <w:r>
+        <w:rPr>
+          <w:rFonts w:asciiTheme="minorHAnsi" w:hAnsiTheme="minorHAnsi" w:cstheme="minorHAnsi"/>
+          <w:b/>
+          <w:bCs/>
+          <w:sz w:val="18"/>
+          <w:szCs w:val="18"/>
+        </w:rPr>
+        <w:t>role-based access control</w:t>
+      </w:r>
+      <w:r>
+        <w:rPr>
+          <w:rFonts w:asciiTheme="minorHAnsi" w:hAnsiTheme="minorHAnsi" w:cstheme="minorHAnsi"/>
+          <w:sz w:val="18"/>
+          <w:szCs w:val="18"/>
+        </w:rPr>
+        <w:t>.</w:t>
       </w:r>
     </w:p>
     <w:p>
@@ -999,7 +1132,43 @@
           <w:sz w:val="18"/>
           <w:szCs w:val="18"/>
         </w:rPr>
-        <w:t>Integrated AI modules through a Python/Flask service and the Google Gemini API.</w:t>
+        <w:t xml:space="preserve">Integrated </w:t>
+      </w:r>
+      <w:r>
+        <w:rPr>
+          <w:rFonts w:asciiTheme="minorHAnsi" w:hAnsiTheme="minorHAnsi" w:cstheme="minorHAnsi"/>
+          <w:b/>
+          <w:bCs/>
+          <w:sz w:val="18"/>
+          <w:szCs w:val="18"/>
+        </w:rPr>
+        <w:t>Razorpay</w:t>
+      </w:r>
+      <w:r>
+        <w:rPr>
+          <w:rFonts w:asciiTheme="minorHAnsi" w:hAnsiTheme="minorHAnsi" w:cstheme="minorHAnsi"/>
+          <w:sz w:val="18"/>
+          <w:szCs w:val="18"/>
+        </w:rPr>
+        <w:t xml:space="preserve"> payment gateways with webhook verification; built subscription lifecycle and </w:t>
+      </w:r>
+      <w:r>
+        <w:rPr>
+          <w:rFonts w:asciiTheme="minorHAnsi" w:hAnsiTheme="minorHAnsi" w:cstheme="minorHAnsi"/>
+          <w:b/>
+          <w:bCs/>
+          <w:sz w:val="18"/>
+          <w:szCs w:val="18"/>
+        </w:rPr>
+        <w:t>automated billing</w:t>
+      </w:r>
+      <w:r>
+        <w:rPr>
+          <w:rFonts w:asciiTheme="minorHAnsi" w:hAnsiTheme="minorHAnsi" w:cstheme="minorHAnsi"/>
+          <w:sz w:val="18"/>
+          <w:szCs w:val="18"/>
+        </w:rPr>
+        <w:t xml:space="preserve"> cron jobs.</w:t>
       </w:r>
     </w:p>
     <w:p>
@@ -1022,15 +1191,86 @@
           <w:sz w:val="18"/>
           <w:szCs w:val="18"/>
         </w:rPr>
-        <w:t>Implemented payment flows for subscriptions and wallet features using Razorpay and Stripe</w:t>
+        <w:t xml:space="preserve">Deployed on </w:t>
       </w:r>
       <w:r>
         <w:rPr>
           <w:rFonts w:asciiTheme="minorHAnsi" w:hAnsiTheme="minorHAnsi" w:cstheme="minorHAnsi"/>
-          <w:sz w:val="18"/>
-          <w:szCs w:val="18"/>
-        </w:rPr>
-        <w:t xml:space="preserve"> and multi-tenant role-based access</w:t>
+          <w:b/>
+          <w:bCs/>
+          <w:sz w:val="18"/>
+          <w:szCs w:val="18"/>
+        </w:rPr>
+        <w:t>AWS EC2</w:t>
+      </w:r>
+      <w:r>
+        <w:rPr>
+          <w:rFonts w:asciiTheme="minorHAnsi" w:hAnsiTheme="minorHAnsi" w:cstheme="minorHAnsi"/>
+          <w:sz w:val="18"/>
+          <w:szCs w:val="18"/>
+        </w:rPr>
+        <w:t xml:space="preserve"> with </w:t>
+      </w:r>
+      <w:r>
+        <w:rPr>
+          <w:rFonts w:asciiTheme="minorHAnsi" w:hAnsiTheme="minorHAnsi" w:cstheme="minorHAnsi"/>
+          <w:b/>
+          <w:bCs/>
+          <w:sz w:val="18"/>
+          <w:szCs w:val="18"/>
+        </w:rPr>
+        <w:t>Nginx</w:t>
+      </w:r>
+      <w:r>
+        <w:rPr>
+          <w:rFonts w:asciiTheme="minorHAnsi" w:hAnsiTheme="minorHAnsi" w:cstheme="minorHAnsi"/>
+          <w:sz w:val="18"/>
+          <w:szCs w:val="18"/>
+        </w:rPr>
+        <w:t xml:space="preserve"> </w:t>
+      </w:r>
+      <w:r>
+        <w:rPr>
+          <w:rFonts w:asciiTheme="minorHAnsi" w:hAnsiTheme="minorHAnsi" w:cstheme="minorHAnsi"/>
+          <w:b/>
+          <w:sz w:val="18"/>
+          <w:szCs w:val="18"/>
+        </w:rPr>
+        <w:t>reverse proxy and SSL</w:t>
+      </w:r>
+      <w:r>
+        <w:rPr>
+          <w:rFonts w:asciiTheme="minorHAnsi" w:hAnsiTheme="minorHAnsi" w:cstheme="minorHAnsi"/>
+          <w:sz w:val="18"/>
+          <w:szCs w:val="18"/>
+        </w:rPr>
+        <w:t xml:space="preserve">; managed Node.js processes using </w:t>
+      </w:r>
+      <w:r>
+        <w:rPr>
+          <w:rFonts w:asciiTheme="minorHAnsi" w:hAnsiTheme="minorHAnsi" w:cstheme="minorHAnsi"/>
+          <w:b/>
+          <w:bCs/>
+          <w:sz w:val="18"/>
+          <w:szCs w:val="18"/>
+        </w:rPr>
+        <w:t>PM2</w:t>
+      </w:r>
+      <w:r>
+        <w:rPr>
+          <w:rFonts w:asciiTheme="minorHAnsi" w:hAnsiTheme="minorHAnsi" w:cstheme="minorHAnsi"/>
+          <w:sz w:val="18"/>
+          <w:szCs w:val="18"/>
+        </w:rPr>
+        <w:t xml:space="preserve"> cluster mode</w:t>
+      </w:r>
+      <w:r>
+        <w:rPr>
+          <w:rFonts w:asciiTheme="minorHAnsi" w:hAnsiTheme="minorHAnsi" w:cstheme="minorHAnsi"/>
+          <w:sz w:val="18"/>
+          <w:szCs w:val="18"/>
+        </w:rPr>
+        <w:t>.</w:t>
       </w:r>
     </w:p>
     <w:p>
@@ -1053,7 +1293,7 @@
           <w:sz w:val="18"/>
           <w:szCs w:val="18"/>
         </w:rPr>
-        <w:t>Contributed to 70+ APIs covering authentication, analytics, gamification, and user management.</w:t>
+        <w:t>Owned sprint planning, code reviews, and feature delivery under Agile methodology.</w:t>
       </w:r>
     </w:p>
     <w:p>
@@ -1066,182 +1306,121 @@
         <w:spacing w:after="0" w:line="240" w:lineRule="auto"/>
         <w:rPr>
           <w:rFonts w:asciiTheme="minorHAnsi" w:hAnsiTheme="minorHAnsi" w:cstheme="minorHAnsi"/>
-          <w:sz w:val="18"/>
-          <w:szCs w:val="18"/>
-        </w:rPr>
-      </w:pPr>
-      <w:r>
-        <w:rPr>
-          <w:rFonts w:cstheme="minorHAnsi"/>
-          <w:sz w:val="18"/>
-          <w:szCs w:val="18"/>
-        </w:rPr>
-        <w:t>Helped build dashboards for students, educators, parents, sellers, admins, and CSR partners.</w:t>
-      </w:r>
-    </w:p>
-    <w:p>
-      <w:pPr>
-        <w:spacing w:after="0" w:line="240" w:lineRule="auto"/>
-        <w:rPr>
-          <w:rStyle w:val="Strong"/>
-          <w:rFonts w:cstheme="minorHAnsi"/>
-          <w:b w:val="0"/>
-          <w:bCs w:val="0"/>
-          <w:sz w:val="18"/>
-          <w:szCs w:val="18"/>
-        </w:rPr>
-      </w:pPr>
-      <w:hyperlink r:id="rId11" w:history="1">
+          <w:b/>
+          <w:bCs/>
+          <w:sz w:val="18"/>
+          <w:szCs w:val="18"/>
+        </w:rPr>
+      </w:pPr>
+      <w:r>
+        <w:rPr>
+          <w:rFonts w:asciiTheme="minorHAnsi" w:hAnsiTheme="minorHAnsi" w:cstheme="minorHAnsi"/>
+          <w:sz w:val="18"/>
+          <w:szCs w:val="18"/>
+        </w:rPr>
+        <w:t>Live Link</w:t>
+      </w:r>
+      <w:r>
+        <w:rPr>
+          <w:rFonts w:asciiTheme="minorHAnsi" w:hAnsiTheme="minorHAnsi" w:cstheme="minorHAnsi"/>
+          <w:b/>
+          <w:bCs/>
+          <w:sz w:val="18"/>
+          <w:szCs w:val="18"/>
+        </w:rPr>
+        <w:t xml:space="preserve">- </w:t>
+      </w:r>
+      <w:r>
+        <w:rPr>
+          <w:rFonts w:asciiTheme="minorHAnsi" w:hAnsiTheme="minorHAnsi" w:cstheme="minorHAnsi"/>
+          <w:b/>
+          <w:bCs/>
+          <w:sz w:val="18"/>
+          <w:szCs w:val="18"/>
+        </w:rPr>
+        <w:t>Wise Student</w:t>
+      </w:r>
+      <w:r>
+        <w:rPr>
+          <w:rFonts w:asciiTheme="minorHAnsi" w:hAnsiTheme="minorHAnsi" w:cstheme="minorHAnsi"/>
+          <w:sz w:val="18"/>
+          <w:szCs w:val="18"/>
+        </w:rPr>
+        <w:t xml:space="preserve">: </w:t>
+      </w:r>
+      <w:hyperlink r:id="rId10" w:history="1">
         <w:r>
           <w:rPr>
             <w:rStyle w:val="Hyperlink"/>
-            <w:rFonts w:cstheme="minorHAnsi"/>
+            <w:rFonts w:asciiTheme="minorHAnsi" w:hAnsiTheme="minorHAnsi" w:cstheme="minorHAnsi"/>
             <w:b/>
             <w:bCs/>
             <w:sz w:val="18"/>
             <w:szCs w:val="18"/>
           </w:rPr>
-          <w:t>Inavora</w:t>
+          <w:t>https://wisestudent.org/</w:t>
         </w:r>
       </w:hyperlink>
       <w:r>
         <w:rPr>
-          <w:rStyle w:val="Strong"/>
-          <w:rFonts w:cstheme="minorHAnsi"/>
-          <w:sz w:val="18"/>
-          <w:szCs w:val="18"/>
-        </w:rPr>
-        <w:t>:</w:t>
+          <w:rFonts w:asciiTheme="minorHAnsi" w:hAnsiTheme="minorHAnsi" w:cstheme="minorHAnsi"/>
+          <w:sz w:val="18"/>
+          <w:szCs w:val="18"/>
+        </w:rPr>
+        <w:t xml:space="preserve"> and </w:t>
+      </w:r>
+      <w:r>
+        <w:rPr>
+          <w:rFonts w:asciiTheme="minorHAnsi" w:hAnsiTheme="minorHAnsi" w:cstheme="minorHAnsi"/>
+          <w:b/>
+          <w:bCs/>
+          <w:sz w:val="18"/>
+          <w:szCs w:val="18"/>
+        </w:rPr>
+        <w:t>Inavora</w:t>
+      </w:r>
+      <w:r>
+        <w:rPr>
+          <w:rFonts w:asciiTheme="minorHAnsi" w:hAnsiTheme="minorHAnsi" w:cstheme="minorHAnsi"/>
+          <w:sz w:val="18"/>
+          <w:szCs w:val="18"/>
+        </w:rPr>
+        <w:t xml:space="preserve">: </w:t>
+      </w:r>
+      <w:hyperlink r:id="rId11" w:history="1">
+        <w:r>
+          <w:rPr>
+            <w:rStyle w:val="Hyperlink"/>
+            <w:rFonts w:asciiTheme="minorHAnsi" w:hAnsiTheme="minorHAnsi" w:cstheme="minorHAnsi"/>
+            <w:b/>
+            <w:bCs/>
+            <w:sz w:val="18"/>
+            <w:szCs w:val="18"/>
+          </w:rPr>
+          <w:t>https://www.inavora.com/</w:t>
+        </w:r>
+      </w:hyperlink>
+      <w:r>
+        <w:rPr>
+          <w:rFonts w:asciiTheme="minorHAnsi" w:hAnsiTheme="minorHAnsi" w:cstheme="minorHAnsi"/>
+          <w:sz w:val="18"/>
+          <w:szCs w:val="18"/>
+        </w:rPr>
+        <w:t xml:space="preserve">  </w:t>
+      </w:r>
+      <w:r>
+        <w:rPr>
+          <w:rFonts w:asciiTheme="minorHAnsi" w:hAnsiTheme="minorHAnsi" w:cstheme="minorHAnsi"/>
+          <w:b/>
+          <w:bCs/>
+          <w:sz w:val="18"/>
+          <w:szCs w:val="18"/>
+        </w:rPr>
+        <w:br/>
       </w:r>
     </w:p>
     <w:p>
       <w:pPr>
-        <w:pStyle w:val="ListParagraph"/>
-        <w:numPr>
-          <w:ilvl w:val="0"/>
-          <w:numId w:val="19"/>
-        </w:numPr>
-        <w:spacing w:after="0" w:line="240" w:lineRule="auto"/>
-        <w:rPr>
-          <w:rFonts w:cstheme="minorHAnsi"/>
-          <w:sz w:val="18"/>
-          <w:szCs w:val="18"/>
-        </w:rPr>
-      </w:pPr>
-      <w:r>
-        <w:rPr>
-          <w:rFonts w:cstheme="minorHAnsi"/>
-          <w:sz w:val="18"/>
-          <w:szCs w:val="18"/>
-        </w:rPr>
-        <w:t>Developed real-time interactive presentation platform with 12+ interaction types.</w:t>
-      </w:r>
-    </w:p>
-    <w:p>
-      <w:pPr>
-        <w:pStyle w:val="ListParagraph"/>
-        <w:numPr>
-          <w:ilvl w:val="0"/>
-          <w:numId w:val="19"/>
-        </w:numPr>
-        <w:spacing w:after="0" w:line="240" w:lineRule="auto"/>
-        <w:rPr>
-          <w:rFonts w:cstheme="minorHAnsi"/>
-          <w:sz w:val="18"/>
-          <w:szCs w:val="18"/>
-        </w:rPr>
-      </w:pPr>
-      <w:r>
-        <w:rPr>
-          <w:rFonts w:cstheme="minorHAnsi"/>
-          <w:sz w:val="18"/>
-          <w:szCs w:val="18"/>
-        </w:rPr>
-        <w:t>Used Socket.IO for instant updates, participant tracking, synced slides.</w:t>
-      </w:r>
-    </w:p>
-    <w:p>
-      <w:pPr>
-        <w:pStyle w:val="ListParagraph"/>
-        <w:numPr>
-          <w:ilvl w:val="0"/>
-          <w:numId w:val="19"/>
-        </w:numPr>
-        <w:spacing w:after="0" w:line="240" w:lineRule="auto"/>
-        <w:rPr>
-          <w:rFonts w:cstheme="minorHAnsi"/>
-          <w:sz w:val="18"/>
-          <w:szCs w:val="18"/>
-        </w:rPr>
-      </w:pPr>
-      <w:r>
-        <w:rPr>
-          <w:rFonts w:cstheme="minorHAnsi"/>
-          <w:sz w:val="18"/>
-          <w:szCs w:val="18"/>
-        </w:rPr>
-        <w:t>Built REST APIs for presentations, slides, and analytics with Express &amp; MongoDB.</w:t>
-      </w:r>
-    </w:p>
-    <w:p>
-      <w:pPr>
-        <w:pStyle w:val="ListParagraph"/>
-        <w:numPr>
-          <w:ilvl w:val="0"/>
-          <w:numId w:val="19"/>
-        </w:numPr>
-        <w:spacing w:after="0" w:line="240" w:lineRule="auto"/>
-        <w:rPr>
-          <w:rFonts w:cstheme="minorHAnsi"/>
-          <w:sz w:val="18"/>
-          <w:szCs w:val="18"/>
-        </w:rPr>
-      </w:pPr>
-      <w:r>
-        <w:rPr>
-          <w:rFonts w:cstheme="minorHAnsi"/>
-          <w:sz w:val="18"/>
-          <w:szCs w:val="18"/>
-        </w:rPr>
-        <w:t>Integrated Firebase Auth + JWT, Razorpay subscriptions, Cloudinary uploads.</w:t>
-      </w:r>
-    </w:p>
-    <w:p>
-      <w:pPr>
-        <w:pStyle w:val="ListParagraph"/>
-        <w:numPr>
-          <w:ilvl w:val="0"/>
-          <w:numId w:val="19"/>
-        </w:numPr>
-        <w:spacing w:after="0" w:line="240" w:lineRule="auto"/>
-        <w:rPr>
-          <w:rFonts w:cstheme="minorHAnsi"/>
-          <w:sz w:val="18"/>
-          <w:szCs w:val="18"/>
-        </w:rPr>
-      </w:pPr>
-      <w:r>
-        <w:rPr>
-          <w:rFonts w:cstheme="minorHAnsi"/>
-          <w:sz w:val="18"/>
-          <w:szCs w:val="18"/>
-        </w:rPr>
-        <w:t>Implemented multi-language support (6+ languages) and real-time charts (Chart.js, D3.js)</w:t>
-      </w:r>
-    </w:p>
-    <w:p>
-      <w:pPr>
-        <w:spacing w:after="0" w:line="240" w:lineRule="auto"/>
-        <w:ind w:left="360"/>
-        <w:rPr>
-          <w:rFonts w:cstheme="minorHAnsi"/>
-          <w:sz w:val="16"/>
-          <w:szCs w:val="16"/>
-        </w:rPr>
-      </w:pPr>
-    </w:p>
-    <w:p>
-      <w:pPr>
         <w:spacing w:after="0" w:line="240" w:lineRule="auto"/>
         <w:rPr>
           <w:sz w:val="22"/>
@@ -1250,33 +1429,27 @@
       </w:pPr>
       <w:r>
         <w:rPr>
-          <w:sz w:val="20"/>
-          <w:szCs w:val="20"/>
-        </w:rPr>
-        <w:t>Data Analyst</w:t>
-      </w:r>
-      <w:r>
-        <w:rPr>
-          <w:sz w:val="20"/>
-          <w:szCs w:val="20"/>
-        </w:rPr>
-        <w:t xml:space="preserve"> Intern </w:t>
-      </w:r>
-      <w:r>
-        <w:rPr>
-          <w:sz w:val="20"/>
-          <w:szCs w:val="20"/>
-        </w:rPr>
-        <w:t xml:space="preserve">| </w:t>
-      </w:r>
-      <w:r>
-        <w:rPr>
-          <w:rStyle w:val="Strong"/>
+          <w:b/>
+          <w:bCs/>
+          <w:sz w:val="20"/>
+          <w:szCs w:val="20"/>
+        </w:rPr>
+        <w:t>Pheme Software Pvt. Ltd</w:t>
+      </w:r>
+      <w:r>
+        <w:rPr>
+          <w:sz w:val="20"/>
+          <w:szCs w:val="20"/>
+        </w:rPr>
+        <w:t>. (IBM Platinum Business Partner)</w:t>
+      </w:r>
+      <w:r>
+        <w:rPr>
           <w:rFonts w:cstheme="minorHAnsi"/>
           <w:sz w:val="20"/>
           <w:szCs w:val="20"/>
         </w:rPr>
-        <w:t>StarApp Solutions</w:t>
+        <w:t>— Remote</w:t>
       </w:r>
       <w:r>
         <w:rPr>
@@ -1284,7 +1457,7 @@
           <w:sz w:val="20"/>
           <w:szCs w:val="20"/>
         </w:rPr>
-        <w:t xml:space="preserve"> — Remote</w:t>
+        <w:tab/>
       </w:r>
       <w:r>
         <w:rPr>
@@ -1324,7 +1497,7 @@
           <w:sz w:val="20"/>
           <w:szCs w:val="20"/>
         </w:rPr>
-        <w:tab/>
+        <w:t xml:space="preserve"> </w:t>
       </w:r>
       <w:r>
         <w:rPr>
@@ -1332,7 +1505,7 @@
           <w:sz w:val="20"/>
           <w:szCs w:val="20"/>
         </w:rPr>
-        <w:tab/>
+        <w:t xml:space="preserve"> </w:t>
       </w:r>
       <w:r>
         <w:rPr>
@@ -1340,28 +1513,63 @@
           <w:sz w:val="20"/>
           <w:szCs w:val="20"/>
         </w:rPr>
-        <w:tab/>
-      </w:r>
-      <w:r>
-        <w:rPr>
-          <w:rFonts w:cstheme="minorHAnsi"/>
-          <w:sz w:val="20"/>
-          <w:szCs w:val="20"/>
-        </w:rPr>
-        <w:t xml:space="preserve">   </w:t>
+        <w:t xml:space="preserve"> </w:t>
       </w:r>
       <w:r>
         <w:rPr>
           <w:rStyle w:val="Emphasis"/>
           <w:rFonts w:cstheme="minorHAnsi"/>
-          <w:sz w:val="20"/>
-          <w:szCs w:val="20"/>
-        </w:rPr>
-        <w:t>May 2025 – Oct 2025</w:t>
-      </w:r>
-      <w:r>
-        <w:rPr>
+          <w:b/>
+          <w:bCs/>
+          <w:i w:val="0"/>
+          <w:iCs w:val="0"/>
+          <w:sz w:val="20"/>
+          <w:szCs w:val="20"/>
+        </w:rPr>
+        <w:t>April</w:t>
+      </w:r>
+      <w:r>
+        <w:rPr>
+          <w:rStyle w:val="Emphasis"/>
           <w:rFonts w:cstheme="minorHAnsi"/>
+          <w:b/>
+          <w:bCs/>
+          <w:i w:val="0"/>
+          <w:iCs w:val="0"/>
+          <w:sz w:val="20"/>
+          <w:szCs w:val="20"/>
+        </w:rPr>
+        <w:t xml:space="preserve"> 2025 – </w:t>
+      </w:r>
+      <w:r>
+        <w:rPr>
+          <w:rStyle w:val="Emphasis"/>
+          <w:rFonts w:cstheme="minorHAnsi"/>
+          <w:b/>
+          <w:bCs/>
+          <w:i w:val="0"/>
+          <w:iCs w:val="0"/>
+          <w:sz w:val="20"/>
+          <w:szCs w:val="20"/>
+        </w:rPr>
+        <w:t>June</w:t>
+      </w:r>
+      <w:r>
+        <w:rPr>
+          <w:rStyle w:val="Emphasis"/>
+          <w:rFonts w:cstheme="minorHAnsi"/>
+          <w:b/>
+          <w:bCs/>
+          <w:i w:val="0"/>
+          <w:iCs w:val="0"/>
+          <w:sz w:val="20"/>
+          <w:szCs w:val="20"/>
+        </w:rPr>
+        <w:t xml:space="preserve"> 2025</w:t>
+      </w:r>
+      <w:r>
+        <w:rPr>
+          <w:rFonts w:cstheme="minorHAnsi"/>
           <w:sz w:val="20"/>
           <w:szCs w:val="20"/>
         </w:rPr>
@@ -1369,12 +1577,13 @@
       </w:r>
       <w:r>
         <w:rPr>
-          <w:rStyle w:val="Strong"/>
           <w:rFonts w:cstheme="minorHAnsi"/>
-          <w:sz w:val="18"/>
-          <w:szCs w:val="18"/>
-        </w:rPr>
-        <w:t>Tech Stack:</w:t>
+          <w:b/>
+          <w:bCs/>
+          <w:sz w:val="18"/>
+          <w:szCs w:val="18"/>
+        </w:rPr>
+        <w:t>ML Intern</w:t>
       </w:r>
       <w:r>
         <w:rPr>
@@ -1382,15 +1591,7 @@
           <w:sz w:val="18"/>
           <w:szCs w:val="18"/>
         </w:rPr>
-        <w:t xml:space="preserve"> </w:t>
-      </w:r>
-      <w:r>
-        <w:rPr>
-          <w:rFonts w:cstheme="minorHAnsi"/>
-          <w:sz w:val="18"/>
-          <w:szCs w:val="18"/>
-        </w:rPr>
-        <w:t>Excel, SQL, Python (Pandas), Google Sheets, basic visualization tools</w:t>
+        <w:t xml:space="preserve"> — Emotion Detection from Facial Expressions</w:t>
       </w:r>
     </w:p>
     <w:p>
@@ -1413,7 +1614,79 @@
           <w:sz w:val="18"/>
           <w:szCs w:val="18"/>
         </w:rPr>
-        <w:t>Cleaned and organized datasets for reporting and trend analysis.</w:t>
+        <w:t xml:space="preserve">Built an </w:t>
+      </w:r>
+      <w:r>
+        <w:rPr>
+          <w:rFonts w:cstheme="minorHAnsi"/>
+          <w:b/>
+          <w:bCs/>
+          <w:sz w:val="18"/>
+          <w:szCs w:val="18"/>
+        </w:rPr>
+        <w:t>Emotion Detection system</w:t>
+      </w:r>
+      <w:r>
+        <w:rPr>
+          <w:rFonts w:cstheme="minorHAnsi"/>
+          <w:sz w:val="18"/>
+          <w:szCs w:val="18"/>
+        </w:rPr>
+        <w:t xml:space="preserve"> using </w:t>
+      </w:r>
+      <w:r>
+        <w:rPr>
+          <w:rFonts w:cstheme="minorHAnsi"/>
+          <w:b/>
+          <w:bCs/>
+          <w:sz w:val="18"/>
+          <w:szCs w:val="18"/>
+        </w:rPr>
+        <w:t>facial expression recognition</w:t>
+      </w:r>
+      <w:r>
+        <w:rPr>
+          <w:rFonts w:cstheme="minorHAnsi"/>
+          <w:sz w:val="18"/>
+          <w:szCs w:val="18"/>
+        </w:rPr>
+        <w:t xml:space="preserve"> with </w:t>
+      </w:r>
+      <w:r>
+        <w:rPr>
+          <w:rFonts w:cstheme="minorHAnsi"/>
+          <w:b/>
+          <w:bCs/>
+          <w:sz w:val="18"/>
+          <w:szCs w:val="18"/>
+        </w:rPr>
+        <w:t>Python</w:t>
+      </w:r>
+      <w:r>
+        <w:rPr>
+          <w:rFonts w:cstheme="minorHAnsi"/>
+          <w:sz w:val="18"/>
+          <w:szCs w:val="18"/>
+        </w:rPr>
+        <w:t xml:space="preserve"> and </w:t>
+      </w:r>
+      <w:r>
+        <w:rPr>
+          <w:rFonts w:cstheme="minorHAnsi"/>
+          <w:b/>
+          <w:bCs/>
+          <w:sz w:val="18"/>
+          <w:szCs w:val="18"/>
+        </w:rPr>
+        <w:t>Computer Vision</w:t>
+      </w:r>
+      <w:r>
+        <w:rPr>
+          <w:rFonts w:cstheme="minorHAnsi"/>
+          <w:sz w:val="18"/>
+          <w:szCs w:val="18"/>
+        </w:rPr>
+        <w:t>.</w:t>
       </w:r>
     </w:p>
     <w:p>
@@ -1436,126 +1709,83 @@
           <w:sz w:val="18"/>
           <w:szCs w:val="18"/>
         </w:rPr>
-        <w:t>Built dashboards and analytical reports using Excel, SQL, and Python.</w:t>
+        <w:t>Worked under mentorship on a real-world ML project in a remote setting.</w:t>
       </w:r>
     </w:p>
     <w:p>
       <w:pPr>
         <w:pStyle w:val="ListParagraph"/>
-        <w:numPr>
-          <w:ilvl w:val="0"/>
-          <w:numId w:val="14"/>
-        </w:numPr>
         <w:spacing w:after="0" w:line="240" w:lineRule="auto"/>
         <w:rPr>
-          <w:rFonts w:cstheme="minorHAnsi"/>
-          <w:sz w:val="18"/>
-          <w:szCs w:val="18"/>
-        </w:rPr>
-      </w:pPr>
-      <w:r>
-        <w:rPr>
-          <w:rFonts w:cstheme="minorHAnsi"/>
-          <w:sz w:val="18"/>
-          <w:szCs w:val="18"/>
-        </w:rPr>
-        <w:t>Improved data quality by identifying issues and adding validation steps.</w:t>
-      </w:r>
+          <w:sz w:val="18"/>
+          <w:szCs w:val="18"/>
+        </w:rPr>
+      </w:pPr>
     </w:p>
     <w:p>
       <w:pPr>
-        <w:pStyle w:val="ListParagraph"/>
-        <w:numPr>
-          <w:ilvl w:val="0"/>
-          <w:numId w:val="14"/>
-        </w:numPr>
         <w:spacing w:after="0" w:line="240" w:lineRule="auto"/>
         <w:rPr>
           <w:b/>
           <w:bCs/>
-          <w:sz w:val="18"/>
-          <w:szCs w:val="18"/>
-        </w:rPr>
-      </w:pPr>
-      <w:r>
-        <w:rPr>
-          <w:rFonts w:cstheme="minorHAnsi"/>
-          <w:sz w:val="18"/>
-          <w:szCs w:val="18"/>
-        </w:rPr>
-        <w:t>Collaborated with team members and worked with real-world datasets in a production setting.</w:t>
-      </w:r>
-    </w:p>
-    <w:p>
-      <w:pPr>
-        <w:pStyle w:val="ListParagraph"/>
-        <w:numPr>
-          <w:ilvl w:val="0"/>
-          <w:numId w:val="14"/>
-        </w:numPr>
-        <w:spacing w:after="0" w:line="240" w:lineRule="auto"/>
-        <w:rPr>
-          <w:sz w:val="18"/>
-          <w:szCs w:val="18"/>
-        </w:rPr>
-      </w:pPr>
-      <w:r>
-        <w:rPr>
-          <w:sz w:val="18"/>
-          <w:szCs w:val="18"/>
-        </w:rPr>
-        <w:t>Supported decision-making with insights and structured data views.</w:t>
-      </w:r>
-    </w:p>
-    <w:p>
-      <w:pPr>
-        <w:pStyle w:val="ListParagraph"/>
-        <w:spacing w:after="0" w:line="240" w:lineRule="auto"/>
-        <w:rPr>
-          <w:sz w:val="18"/>
-          <w:szCs w:val="18"/>
-        </w:rPr>
-      </w:pPr>
-    </w:p>
-    <w:p>
-      <w:pPr>
-        <w:spacing w:after="0" w:line="240" w:lineRule="auto"/>
-        <w:rPr>
-          <w:b/>
-          <w:bCs/>
-          <w:sz w:val="20"/>
-          <w:szCs w:val="20"/>
-        </w:rPr>
-      </w:pPr>
-      <w:r>
-        <w:rPr>
-          <w:b/>
-          <w:bCs/>
-          <w:sz w:val="20"/>
-          <w:szCs w:val="20"/>
-        </w:rPr>
-        <w:t xml:space="preserve">ACADEMIC </w:t>
-      </w:r>
-      <w:r>
-        <w:rPr>
-          <w:b/>
-          <w:bCs/>
-          <w:sz w:val="20"/>
-          <w:szCs w:val="20"/>
+          <w:sz w:val="20"/>
+          <w:szCs w:val="20"/>
+        </w:rPr>
+      </w:pPr>
+      <w:r>
+        <w:rPr>
+          <w:b/>
+          <w:bCs/>
+          <w:sz w:val="22"/>
+          <w:szCs w:val="22"/>
+        </w:rPr>
+        <w:t xml:space="preserve">KEY </w:t>
+      </w:r>
+      <w:r>
+        <w:rPr>
+          <w:b/>
+          <w:bCs/>
+          <w:sz w:val="22"/>
+          <w:szCs w:val="22"/>
         </w:rPr>
         <w:t>PROJECTS</w:t>
       </w:r>
-    </w:p>
-    <w:p>
-      <w:pPr>
-        <w:spacing w:after="0" w:line="240" w:lineRule="auto"/>
-        <w:rPr>
-          <w:b/>
-          <w:bCs/>
-          <w:sz w:val="20"/>
-          <w:szCs w:val="20"/>
-        </w:rPr>
-      </w:pPr>
+      <w:r>
+        <w:rPr>
+          <w:b/>
+          <w:bCs/>
+          <w:sz w:val="20"/>
+          <w:szCs w:val="20"/>
+        </w:rPr>
+        <w:br/>
+      </w:r>
+      <w:r>
+        <w:rPr>
+          <w:b/>
+          <w:bCs/>
+          <w:sz w:val="20"/>
+          <w:szCs w:val="20"/>
+        </w:rPr>
+        <w:t>AI Usage Discovery &amp; Shadow AI Risk Dashboard</w:t>
+      </w:r>
+      <w:r>
+        <w:rPr>
+          <w:b/>
+          <w:bCs/>
+          <w:sz w:val="20"/>
+          <w:szCs w:val="20"/>
+        </w:rPr>
+        <w:t xml:space="preserve"> |</w:t>
+      </w:r>
+      <w:r>
+        <w:rPr>
+          <w:b/>
+          <w:bCs/>
+          <w:sz w:val="20"/>
+          <w:szCs w:val="20"/>
+        </w:rPr>
+        <w:t xml:space="preserve"> </w:t>
+      </w:r>
       <w:hyperlink r:id="rId12" w:history="1">
         <w:r>
           <w:rPr>
@@ -1565,8 +1795,550 @@
             <w:sz w:val="20"/>
             <w:szCs w:val="20"/>
           </w:rPr>
-          <w:t>Stare</w:t>
+          <w:t>https://shadowsnitch.vercel.app/</w:t>
         </w:r>
+      </w:hyperlink>
+      <w:r>
+        <w:rPr>
+          <w:b/>
+          <w:bCs/>
+          <w:sz w:val="20"/>
+          <w:szCs w:val="20"/>
+        </w:rPr>
+        <w:br/>
+      </w:r>
+      <w:r>
+        <w:rPr>
+          <w:b/>
+          <w:bCs/>
+          <w:sz w:val="18"/>
+          <w:szCs w:val="18"/>
+        </w:rPr>
+        <w:t xml:space="preserve">Tech stack: </w:t>
+      </w:r>
+      <w:r>
+        <w:rPr>
+          <w:b/>
+          <w:bCs/>
+          <w:sz w:val="18"/>
+          <w:szCs w:val="18"/>
+        </w:rPr>
+        <w:t xml:space="preserve">Python, FastAPI, Uvicorn, PostgreSQL, SQLAlchemy, </w:t>
+      </w:r>
+      <w:r>
+        <w:rPr>
+          <w:b/>
+          <w:bCs/>
+          <w:sz w:val="18"/>
+          <w:szCs w:val="18"/>
+        </w:rPr>
+        <w:t>Alembic</w:t>
+      </w:r>
+      <w:r>
+        <w:rPr>
+          <w:b/>
+          <w:bCs/>
+          <w:sz w:val="18"/>
+          <w:szCs w:val="18"/>
+        </w:rPr>
+        <w:t>, Psycopg2,</w:t>
+      </w:r>
+      <w:r>
+        <w:rPr>
+          <w:b/>
+          <w:bCs/>
+          <w:sz w:val="18"/>
+          <w:szCs w:val="18"/>
+        </w:rPr>
+        <w:t xml:space="preserve"> </w:t>
+      </w:r>
+      <w:r>
+        <w:rPr>
+          <w:b/>
+          <w:bCs/>
+          <w:sz w:val="18"/>
+          <w:szCs w:val="18"/>
+        </w:rPr>
+        <w:t>React.js, Tailwind CSS, and Lucide React Icons</w:t>
+      </w:r>
+      <w:r>
+        <w:rPr>
+          <w:sz w:val="18"/>
+          <w:szCs w:val="18"/>
+        </w:rPr>
+        <w:t>.</w:t>
+      </w:r>
+    </w:p>
+    <w:p>
+      <w:pPr>
+        <w:numPr>
+          <w:ilvl w:val="0"/>
+          <w:numId w:val="4"/>
+        </w:numPr>
+        <w:spacing w:after="0" w:line="240" w:lineRule="auto"/>
+        <w:rPr>
+          <w:b/>
+          <w:bCs/>
+          <w:sz w:val="20"/>
+          <w:szCs w:val="20"/>
+        </w:rPr>
+      </w:pPr>
+      <w:r>
+        <w:rPr>
+          <w:sz w:val="18"/>
+          <w:szCs w:val="18"/>
+        </w:rPr>
+        <w:t>Built a B2B SaaS platform that detects which AI tools employees use inside an organization via a privacy-first Chrome browser extension.</w:t>
+      </w:r>
+    </w:p>
+    <w:p>
+      <w:pPr>
+        <w:numPr>
+          <w:ilvl w:val="0"/>
+          <w:numId w:val="4"/>
+        </w:numPr>
+        <w:spacing w:after="0" w:line="240" w:lineRule="auto"/>
+        <w:rPr>
+          <w:b/>
+          <w:bCs/>
+          <w:sz w:val="20"/>
+          <w:szCs w:val="20"/>
+        </w:rPr>
+      </w:pPr>
+      <w:r>
+        <w:rPr>
+          <w:sz w:val="18"/>
+          <w:szCs w:val="18"/>
+        </w:rPr>
+        <w:t xml:space="preserve">Developed </w:t>
+      </w:r>
+      <w:r>
+        <w:rPr>
+          <w:b/>
+          <w:bCs/>
+          <w:sz w:val="18"/>
+          <w:szCs w:val="18"/>
+        </w:rPr>
+        <w:t>multi-tenant</w:t>
+      </w:r>
+      <w:r>
+        <w:rPr>
+          <w:sz w:val="18"/>
+          <w:szCs w:val="18"/>
+        </w:rPr>
+        <w:t xml:space="preserve"> backend with </w:t>
+      </w:r>
+      <w:r>
+        <w:rPr>
+          <w:b/>
+          <w:bCs/>
+          <w:sz w:val="18"/>
+          <w:szCs w:val="18"/>
+        </w:rPr>
+        <w:t>FastAPI</w:t>
+      </w:r>
+      <w:r>
+        <w:rPr>
+          <w:sz w:val="18"/>
+          <w:szCs w:val="18"/>
+        </w:rPr>
+        <w:t xml:space="preserve"> and </w:t>
+      </w:r>
+      <w:r>
+        <w:rPr>
+          <w:b/>
+          <w:bCs/>
+          <w:sz w:val="18"/>
+          <w:szCs w:val="18"/>
+        </w:rPr>
+        <w:t>PostgreSQL</w:t>
+      </w:r>
+      <w:r>
+        <w:rPr>
+          <w:sz w:val="18"/>
+          <w:szCs w:val="18"/>
+        </w:rPr>
+        <w:t xml:space="preserve"> covering organizations, users, departments, AI tool catalog, sessions, and event ingestion</w:t>
+      </w:r>
+      <w:r>
+        <w:rPr>
+          <w:sz w:val="18"/>
+          <w:szCs w:val="18"/>
+        </w:rPr>
+        <w:t>.</w:t>
+      </w:r>
+    </w:p>
+    <w:p>
+      <w:pPr>
+        <w:numPr>
+          <w:ilvl w:val="0"/>
+          <w:numId w:val="4"/>
+        </w:numPr>
+        <w:spacing w:after="0" w:line="240" w:lineRule="auto"/>
+        <w:rPr>
+          <w:b/>
+          <w:bCs/>
+          <w:sz w:val="20"/>
+          <w:szCs w:val="20"/>
+        </w:rPr>
+      </w:pPr>
+      <w:r>
+        <w:rPr>
+          <w:sz w:val="18"/>
+          <w:szCs w:val="18"/>
+        </w:rPr>
+        <w:t xml:space="preserve">Built </w:t>
+      </w:r>
+      <w:r>
+        <w:rPr>
+          <w:b/>
+          <w:bCs/>
+          <w:sz w:val="18"/>
+          <w:szCs w:val="18"/>
+        </w:rPr>
+        <w:t>Shadow AI detection system</w:t>
+      </w:r>
+      <w:r>
+        <w:rPr>
+          <w:sz w:val="18"/>
+          <w:szCs w:val="18"/>
+        </w:rPr>
+        <w:t xml:space="preserve"> — flags unknown, restricted, and blocked </w:t>
+      </w:r>
+      <w:r>
+        <w:rPr>
+          <w:b/>
+          <w:bCs/>
+          <w:sz w:val="18"/>
+          <w:szCs w:val="18"/>
+        </w:rPr>
+        <w:t>AI tools</w:t>
+      </w:r>
+      <w:r>
+        <w:rPr>
+          <w:sz w:val="18"/>
+          <w:szCs w:val="18"/>
+        </w:rPr>
+        <w:t xml:space="preserve"> with </w:t>
+      </w:r>
+      <w:r>
+        <w:rPr>
+          <w:b/>
+          <w:bCs/>
+          <w:sz w:val="18"/>
+          <w:szCs w:val="18"/>
+        </w:rPr>
+        <w:t>rule-based risk scoring (0–100)</w:t>
+      </w:r>
+      <w:r>
+        <w:rPr>
+          <w:sz w:val="18"/>
+          <w:szCs w:val="18"/>
+        </w:rPr>
+        <w:t xml:space="preserve"> across tools, users, and departments.</w:t>
+      </w:r>
+    </w:p>
+    <w:p>
+      <w:pPr>
+        <w:numPr>
+          <w:ilvl w:val="0"/>
+          <w:numId w:val="4"/>
+        </w:numPr>
+        <w:spacing w:after="0" w:line="240" w:lineRule="auto"/>
+        <w:rPr>
+          <w:b/>
+          <w:bCs/>
+          <w:sz w:val="20"/>
+          <w:szCs w:val="20"/>
+        </w:rPr>
+      </w:pPr>
+      <w:r>
+        <w:rPr>
+          <w:sz w:val="18"/>
+          <w:szCs w:val="18"/>
+        </w:rPr>
+        <w:t xml:space="preserve">Designed </w:t>
+      </w:r>
+      <w:r>
+        <w:rPr>
+          <w:b/>
+          <w:bCs/>
+          <w:sz w:val="18"/>
+          <w:szCs w:val="18"/>
+        </w:rPr>
+        <w:t>event-driven architecture</w:t>
+      </w:r>
+      <w:r>
+        <w:rPr>
+          <w:sz w:val="18"/>
+          <w:szCs w:val="18"/>
+        </w:rPr>
+        <w:t xml:space="preserve"> where all </w:t>
+      </w:r>
+      <w:r>
+        <w:rPr>
+          <w:b/>
+          <w:bCs/>
+          <w:sz w:val="18"/>
+          <w:szCs w:val="18"/>
+        </w:rPr>
+        <w:t>browser</w:t>
+      </w:r>
+      <w:r>
+        <w:rPr>
+          <w:sz w:val="18"/>
+          <w:szCs w:val="18"/>
+        </w:rPr>
+        <w:t xml:space="preserve"> activity generates structured events </w:t>
+      </w:r>
+      <w:r>
+        <w:rPr>
+          <w:b/>
+          <w:bCs/>
+          <w:sz w:val="18"/>
+          <w:szCs w:val="18"/>
+        </w:rPr>
+        <w:t>powering analytics</w:t>
+      </w:r>
+      <w:r>
+        <w:rPr>
+          <w:sz w:val="18"/>
+          <w:szCs w:val="18"/>
+        </w:rPr>
+        <w:t xml:space="preserve">, </w:t>
+      </w:r>
+      <w:r>
+        <w:rPr>
+          <w:b/>
+          <w:bCs/>
+          <w:sz w:val="18"/>
+          <w:szCs w:val="18"/>
+        </w:rPr>
+        <w:t>alerts</w:t>
+      </w:r>
+      <w:r>
+        <w:rPr>
+          <w:sz w:val="18"/>
+          <w:szCs w:val="18"/>
+        </w:rPr>
+        <w:t xml:space="preserve">, and </w:t>
+      </w:r>
+      <w:r>
+        <w:rPr>
+          <w:b/>
+          <w:bCs/>
+          <w:sz w:val="18"/>
+          <w:szCs w:val="18"/>
+        </w:rPr>
+        <w:t>reports</w:t>
+      </w:r>
+      <w:r>
+        <w:rPr>
+          <w:sz w:val="18"/>
+          <w:szCs w:val="18"/>
+        </w:rPr>
+        <w:t>.</w:t>
+      </w:r>
+    </w:p>
+    <w:p>
+      <w:pPr>
+        <w:numPr>
+          <w:ilvl w:val="0"/>
+          <w:numId w:val="4"/>
+        </w:numPr>
+        <w:spacing w:after="0" w:line="240" w:lineRule="auto"/>
+        <w:rPr>
+          <w:b/>
+          <w:bCs/>
+          <w:sz w:val="20"/>
+          <w:szCs w:val="20"/>
+        </w:rPr>
+      </w:pPr>
+      <w:r>
+        <w:rPr>
+          <w:sz w:val="18"/>
+          <w:szCs w:val="18"/>
+        </w:rPr>
+        <w:t xml:space="preserve">Implemented </w:t>
+      </w:r>
+      <w:r>
+        <w:rPr>
+          <w:b/>
+          <w:bCs/>
+          <w:sz w:val="18"/>
+          <w:szCs w:val="18"/>
+        </w:rPr>
+        <w:t>analytics dashboard</w:t>
+      </w:r>
+      <w:r>
+        <w:rPr>
+          <w:sz w:val="18"/>
+          <w:szCs w:val="18"/>
+        </w:rPr>
+        <w:t xml:space="preserve"> with </w:t>
+      </w:r>
+      <w:r>
+        <w:rPr>
+          <w:b/>
+          <w:bCs/>
+          <w:sz w:val="18"/>
+          <w:szCs w:val="18"/>
+        </w:rPr>
+        <w:t>usage stats</w:t>
+      </w:r>
+      <w:r>
+        <w:rPr>
+          <w:sz w:val="18"/>
+          <w:szCs w:val="18"/>
+        </w:rPr>
+        <w:t xml:space="preserve">, </w:t>
+      </w:r>
+      <w:r>
+        <w:rPr>
+          <w:b/>
+          <w:bCs/>
+          <w:sz w:val="18"/>
+          <w:szCs w:val="18"/>
+        </w:rPr>
+        <w:t>adoption trends</w:t>
+      </w:r>
+      <w:r>
+        <w:rPr>
+          <w:sz w:val="18"/>
+          <w:szCs w:val="18"/>
+        </w:rPr>
+        <w:t xml:space="preserve">, top tools/users, </w:t>
+      </w:r>
+      <w:r>
+        <w:rPr>
+          <w:b/>
+          <w:bCs/>
+          <w:sz w:val="18"/>
+          <w:szCs w:val="18"/>
+        </w:rPr>
+        <w:t>department-level risk</w:t>
+      </w:r>
+      <w:r>
+        <w:rPr>
+          <w:sz w:val="18"/>
+          <w:szCs w:val="18"/>
+        </w:rPr>
+        <w:t xml:space="preserve">, and </w:t>
+      </w:r>
+      <w:r>
+        <w:rPr>
+          <w:b/>
+          <w:bCs/>
+          <w:sz w:val="18"/>
+          <w:szCs w:val="18"/>
+        </w:rPr>
+        <w:t>CSV/PDF</w:t>
+      </w:r>
+      <w:r>
+        <w:rPr>
+          <w:sz w:val="18"/>
+          <w:szCs w:val="18"/>
+        </w:rPr>
+        <w:t xml:space="preserve"> export.</w:t>
+      </w:r>
+    </w:p>
+    <w:p>
+      <w:pPr>
+        <w:numPr>
+          <w:ilvl w:val="0"/>
+          <w:numId w:val="4"/>
+        </w:numPr>
+        <w:spacing w:after="0" w:line="240" w:lineRule="auto"/>
+        <w:rPr>
+          <w:b/>
+          <w:bCs/>
+          <w:sz w:val="20"/>
+          <w:szCs w:val="20"/>
+        </w:rPr>
+      </w:pPr>
+      <w:r>
+        <w:rPr>
+          <w:b/>
+          <w:bCs/>
+          <w:sz w:val="18"/>
+          <w:szCs w:val="18"/>
+        </w:rPr>
+        <w:t>Extension</w:t>
+      </w:r>
+      <w:r>
+        <w:rPr>
+          <w:sz w:val="18"/>
+          <w:szCs w:val="18"/>
+        </w:rPr>
+        <w:t xml:space="preserve"> tracks only </w:t>
+      </w:r>
+      <w:r>
+        <w:rPr>
+          <w:b/>
+          <w:bCs/>
+          <w:sz w:val="18"/>
+          <w:szCs w:val="18"/>
+        </w:rPr>
+        <w:t>metadata</w:t>
+      </w:r>
+      <w:r>
+        <w:rPr>
+          <w:sz w:val="18"/>
+          <w:szCs w:val="18"/>
+        </w:rPr>
+        <w:t xml:space="preserve"> (tool name, domain, session duration, browser, OS) — never collects prompts, responses, passwords, or screenshots.</w:t>
+      </w:r>
+    </w:p>
+    <w:p>
+      <w:pPr>
+        <w:spacing w:after="0" w:line="240" w:lineRule="auto"/>
+        <w:ind w:left="720"/>
+        <w:rPr>
+          <w:b/>
+          <w:bCs/>
+          <w:sz w:val="20"/>
+          <w:szCs w:val="20"/>
+        </w:rPr>
+      </w:pPr>
+    </w:p>
+    <w:p>
+      <w:pPr>
+        <w:spacing w:after="0" w:line="240" w:lineRule="auto"/>
+        <w:rPr>
+          <w:b/>
+          <w:bCs/>
+          <w:sz w:val="20"/>
+          <w:szCs w:val="20"/>
+        </w:rPr>
+      </w:pPr>
+      <w:r>
+        <w:rPr>
+          <w:b/>
+          <w:bCs/>
+          <w:sz w:val="20"/>
+          <w:szCs w:val="20"/>
+        </w:rPr>
+        <w:t xml:space="preserve">StareX </w:t>
+      </w:r>
+      <w:r>
+        <w:rPr>
+          <w:b/>
+          <w:bCs/>
+          <w:sz w:val="20"/>
+          <w:szCs w:val="20"/>
+        </w:rPr>
+        <w:t>Real-Time Chat Application</w:t>
+      </w:r>
+      <w:r>
+        <w:rPr>
+          <w:b/>
+          <w:bCs/>
+          <w:sz w:val="20"/>
+          <w:szCs w:val="20"/>
+        </w:rPr>
+        <w:t xml:space="preserve"> | </w:t>
+      </w:r>
+      <w:hyperlink r:id="rId13" w:history="1">
         <w:r>
           <w:rPr>
             <w:rStyle w:val="Hyperlink"/>
@@ -1575,18 +2347,9 @@
             <w:sz w:val="20"/>
             <w:szCs w:val="20"/>
           </w:rPr>
-          <w:t>X</w:t>
+          <w:t>https://starex-hub.onrender.com/</w:t>
         </w:r>
       </w:hyperlink>
-      <w:r>
-        <w:rPr>
-          <w:b/>
-          <w:bCs/>
-          <w:sz w:val="20"/>
-          <w:szCs w:val="20"/>
-        </w:rPr>
-        <w:t xml:space="preserve"> | Real-Time Chat Application</w:t>
-      </w:r>
     </w:p>
     <w:p>
       <w:pPr>
@@ -1632,7 +2395,94 @@
           <w:sz w:val="18"/>
           <w:szCs w:val="18"/>
         </w:rPr>
-        <w:t>Made a real-time chat app that responds quickly so that users can talk to each other easily.</w:t>
+        <w:t xml:space="preserve">Built a full-stack </w:t>
+      </w:r>
+      <w:r>
+        <w:rPr>
+          <w:b/>
+          <w:bCs/>
+          <w:sz w:val="18"/>
+          <w:szCs w:val="18"/>
+        </w:rPr>
+        <w:t>real-time</w:t>
+      </w:r>
+      <w:r>
+        <w:rPr>
+          <w:sz w:val="18"/>
+          <w:szCs w:val="18"/>
+        </w:rPr>
+        <w:t xml:space="preserve"> chat application with </w:t>
+      </w:r>
+      <w:r>
+        <w:rPr>
+          <w:b/>
+          <w:bCs/>
+          <w:sz w:val="18"/>
+          <w:szCs w:val="18"/>
+        </w:rPr>
+        <w:t>Socket.io</w:t>
+      </w:r>
+      <w:r>
+        <w:rPr>
+          <w:sz w:val="18"/>
+          <w:szCs w:val="18"/>
+        </w:rPr>
+        <w:t xml:space="preserve"> enabling instant </w:t>
+      </w:r>
+      <w:r>
+        <w:rPr>
+          <w:b/>
+          <w:bCs/>
+          <w:sz w:val="18"/>
+          <w:szCs w:val="18"/>
+        </w:rPr>
+        <w:t>bidirectional messaging</w:t>
+      </w:r>
+      <w:r>
+        <w:rPr>
+          <w:sz w:val="18"/>
+          <w:szCs w:val="18"/>
+        </w:rPr>
+        <w:t xml:space="preserve">, </w:t>
+      </w:r>
+      <w:r>
+        <w:rPr>
+          <w:b/>
+          <w:bCs/>
+          <w:sz w:val="18"/>
+          <w:szCs w:val="18"/>
+        </w:rPr>
+        <w:t>JWT-based auth</w:t>
+      </w:r>
+      <w:r>
+        <w:rPr>
+          <w:sz w:val="18"/>
+          <w:szCs w:val="18"/>
+        </w:rPr>
+        <w:t xml:space="preserve">, and </w:t>
+      </w:r>
+      <w:r>
+        <w:rPr>
+          <w:b/>
+          <w:bCs/>
+          <w:sz w:val="18"/>
+          <w:szCs w:val="18"/>
+        </w:rPr>
+        <w:t>MongoDB</w:t>
+      </w:r>
+      <w:r>
+        <w:rPr>
+          <w:sz w:val="18"/>
+          <w:szCs w:val="18"/>
+        </w:rPr>
+        <w:t xml:space="preserve"> message persistence</w:t>
+      </w:r>
+      <w:r>
+        <w:rPr>
+          <w:sz w:val="18"/>
+          <w:szCs w:val="18"/>
+        </w:rPr>
+        <w:t>.</w:t>
       </w:r>
     </w:p>
     <w:p>
@@ -1652,7 +2502,46 @@
           <w:sz w:val="18"/>
           <w:szCs w:val="18"/>
         </w:rPr>
-        <w:t>Used Socket.io for real-time updates and instant messaging.</w:t>
+        <w:t xml:space="preserve">Implemented </w:t>
+      </w:r>
+      <w:r>
+        <w:rPr>
+          <w:b/>
+          <w:bCs/>
+          <w:sz w:val="18"/>
+          <w:szCs w:val="18"/>
+        </w:rPr>
+        <w:t>JWT-based authentication</w:t>
+      </w:r>
+      <w:r>
+        <w:rPr>
+          <w:sz w:val="18"/>
+          <w:szCs w:val="18"/>
+        </w:rPr>
+        <w:t xml:space="preserve"> with </w:t>
+      </w:r>
+      <w:r>
+        <w:rPr>
+          <w:b/>
+          <w:bCs/>
+          <w:sz w:val="18"/>
+          <w:szCs w:val="18"/>
+        </w:rPr>
+        <w:t>secure login</w:t>
+      </w:r>
+      <w:r>
+        <w:rPr>
+          <w:sz w:val="18"/>
+          <w:szCs w:val="18"/>
+        </w:rPr>
+        <w:t>, protected routes, and session management</w:t>
+      </w:r>
+      <w:r>
+        <w:rPr>
+          <w:sz w:val="18"/>
+          <w:szCs w:val="18"/>
+        </w:rPr>
+        <w:t>.</w:t>
       </w:r>
     </w:p>
     <w:p>
@@ -1672,249 +2561,216 @@
           <w:sz w:val="18"/>
           <w:szCs w:val="18"/>
         </w:rPr>
-        <w:t>Created an easy-to-use interface that makes it easy to get around and keeps people interested.</w:t>
+        <w:t xml:space="preserve">Designed a </w:t>
+      </w:r>
+      <w:r>
+        <w:rPr>
+          <w:b/>
+          <w:bCs/>
+          <w:sz w:val="18"/>
+          <w:szCs w:val="18"/>
+        </w:rPr>
+        <w:t>clean</w:t>
+      </w:r>
+      <w:r>
+        <w:rPr>
+          <w:sz w:val="18"/>
+          <w:szCs w:val="18"/>
+        </w:rPr>
+        <w:t xml:space="preserve">, </w:t>
+      </w:r>
+      <w:r>
+        <w:rPr>
+          <w:b/>
+          <w:bCs/>
+          <w:sz w:val="18"/>
+          <w:szCs w:val="18"/>
+        </w:rPr>
+        <w:t>responsive UI</w:t>
+      </w:r>
+      <w:r>
+        <w:rPr>
+          <w:sz w:val="18"/>
+          <w:szCs w:val="18"/>
+        </w:rPr>
+        <w:t xml:space="preserve"> with </w:t>
+      </w:r>
+      <w:r>
+        <w:rPr>
+          <w:b/>
+          <w:bCs/>
+          <w:sz w:val="18"/>
+          <w:szCs w:val="18"/>
+        </w:rPr>
+        <w:t>Tailwind CSS</w:t>
+      </w:r>
+      <w:r>
+        <w:rPr>
+          <w:sz w:val="18"/>
+          <w:szCs w:val="18"/>
+        </w:rPr>
+        <w:t xml:space="preserve"> featuring </w:t>
+      </w:r>
+      <w:r>
+        <w:rPr>
+          <w:b/>
+          <w:sz w:val="18"/>
+          <w:szCs w:val="18"/>
+        </w:rPr>
+        <w:t>real-time message delivery</w:t>
+      </w:r>
+      <w:r>
+        <w:rPr>
+          <w:sz w:val="18"/>
+          <w:szCs w:val="18"/>
+        </w:rPr>
+        <w:t xml:space="preserve">, </w:t>
+      </w:r>
+      <w:r>
+        <w:rPr>
+          <w:b/>
+          <w:bCs/>
+          <w:sz w:val="18"/>
+          <w:szCs w:val="18"/>
+        </w:rPr>
+        <w:t>chat history</w:t>
+      </w:r>
+      <w:r>
+        <w:rPr>
+          <w:sz w:val="18"/>
+          <w:szCs w:val="18"/>
+        </w:rPr>
+        <w:t xml:space="preserve">, and </w:t>
+      </w:r>
+      <w:r>
+        <w:rPr>
+          <w:b/>
+          <w:bCs/>
+          <w:sz w:val="18"/>
+          <w:szCs w:val="18"/>
+        </w:rPr>
+        <w:t>intuitive navigation</w:t>
+      </w:r>
+      <w:r>
+        <w:rPr>
+          <w:sz w:val="18"/>
+          <w:szCs w:val="18"/>
+        </w:rPr>
+        <w:t>.</w:t>
       </w:r>
     </w:p>
     <w:p>
       <w:pPr>
+        <w:numPr>
+          <w:ilvl w:val="0"/>
+          <w:numId w:val="4"/>
+        </w:numPr>
         <w:spacing w:after="0" w:line="240" w:lineRule="auto"/>
-        <w:ind w:left="720"/>
-        <w:rPr>
-          <w:sz w:val="18"/>
-          <w:szCs w:val="18"/>
-        </w:rPr>
-      </w:pPr>
+        <w:rPr>
+          <w:sz w:val="18"/>
+          <w:szCs w:val="18"/>
+        </w:rPr>
+      </w:pPr>
+      <w:r>
+        <w:rPr>
+          <w:sz w:val="18"/>
+          <w:szCs w:val="18"/>
+        </w:rPr>
+        <w:t xml:space="preserve">Deployed the application on </w:t>
+      </w:r>
+      <w:r>
+        <w:rPr>
+          <w:b/>
+          <w:bCs/>
+          <w:sz w:val="18"/>
+          <w:szCs w:val="18"/>
+        </w:rPr>
+        <w:t>Render</w:t>
+      </w:r>
+      <w:r>
+        <w:rPr>
+          <w:sz w:val="18"/>
+          <w:szCs w:val="18"/>
+        </w:rPr>
+        <w:t xml:space="preserve"> with a </w:t>
+      </w:r>
+      <w:r>
+        <w:rPr>
+          <w:b/>
+          <w:bCs/>
+          <w:sz w:val="18"/>
+          <w:szCs w:val="18"/>
+        </w:rPr>
+        <w:t>Node.js</w:t>
+      </w:r>
+      <w:r>
+        <w:rPr>
+          <w:sz w:val="18"/>
+          <w:szCs w:val="18"/>
+        </w:rPr>
+        <w:t xml:space="preserve"> backend, </w:t>
+      </w:r>
+      <w:r>
+        <w:rPr>
+          <w:b/>
+          <w:bCs/>
+          <w:sz w:val="18"/>
+          <w:szCs w:val="18"/>
+        </w:rPr>
+        <w:t>MongoDB Atlas</w:t>
+      </w:r>
+      <w:r>
+        <w:rPr>
+          <w:sz w:val="18"/>
+          <w:szCs w:val="18"/>
+        </w:rPr>
+        <w:t xml:space="preserve"> cloud database, and </w:t>
+      </w:r>
+      <w:r>
+        <w:rPr>
+          <w:b/>
+          <w:bCs/>
+          <w:sz w:val="18"/>
+          <w:szCs w:val="18"/>
+        </w:rPr>
+        <w:t>REST API</w:t>
+      </w:r>
+      <w:r>
+        <w:rPr>
+          <w:sz w:val="18"/>
+          <w:szCs w:val="18"/>
+        </w:rPr>
+        <w:t xml:space="preserve"> architecture.</w:t>
+      </w:r>
     </w:p>
     <w:p>
       <w:pPr>
+        <w:pStyle w:val="ListParagraph"/>
         <w:spacing w:after="0" w:line="240" w:lineRule="auto"/>
         <w:rPr>
-          <w:b/>
-          <w:bCs/>
-          <w:sz w:val="20"/>
-          <w:szCs w:val="20"/>
-        </w:rPr>
-      </w:pPr>
-      <w:r>
-        <w:rPr>
-          <w:b/>
-          <w:bCs/>
-          <w:sz w:val="20"/>
-          <w:szCs w:val="20"/>
-        </w:rPr>
-        <w:t>HES Volunteer | Ullas Trust</w:t>
-      </w:r>
-      <w:r>
-        <w:rPr>
+          <w:sz w:val="20"/>
+          <w:szCs w:val="20"/>
+        </w:rPr>
+      </w:pPr>
+    </w:p>
+    <w:p>
+      <w:pPr>
+        <w:spacing w:after="0" w:line="240" w:lineRule="auto"/>
+        <w:rPr>
+          <w:b/>
+          <w:bCs/>
           <w:sz w:val="22"/>
           <w:szCs w:val="22"/>
         </w:rPr>
-        <w:t xml:space="preserve"> </w:t>
-      </w:r>
-      <w:r>
-        <w:rPr>
+      </w:pPr>
+      <w:r>
+        <w:rPr>
+          <w:b/>
+          <w:bCs/>
           <w:sz w:val="22"/>
           <w:szCs w:val="22"/>
         </w:rPr>
-        <w:t>(Polaris Group CSR Initiative)</w:t>
-      </w:r>
-      <w:r>
-        <w:rPr>
-          <w:sz w:val="22"/>
-          <w:szCs w:val="22"/>
-        </w:rPr>
-        <w:tab/>
-      </w:r>
-      <w:r>
-        <w:rPr>
-          <w:sz w:val="22"/>
-          <w:szCs w:val="22"/>
-        </w:rPr>
-        <w:tab/>
-      </w:r>
-      <w:r>
-        <w:rPr>
-          <w:sz w:val="22"/>
-          <w:szCs w:val="22"/>
-        </w:rPr>
-        <w:tab/>
-      </w:r>
-      <w:r>
-        <w:rPr>
-          <w:sz w:val="22"/>
-          <w:szCs w:val="22"/>
-        </w:rPr>
-        <w:tab/>
-      </w:r>
-      <w:r>
-        <w:rPr>
-          <w:sz w:val="22"/>
-          <w:szCs w:val="22"/>
-        </w:rPr>
-        <w:tab/>
-      </w:r>
-      <w:r>
-        <w:rPr>
-          <w:sz w:val="22"/>
-          <w:szCs w:val="22"/>
-        </w:rPr>
-        <w:tab/>
-      </w:r>
-      <w:r>
-        <w:rPr>
-          <w:sz w:val="22"/>
-          <w:szCs w:val="22"/>
-        </w:rPr>
-        <w:tab/>
-      </w:r>
-      <w:r>
-        <w:rPr>
-          <w:i/>
-          <w:iCs/>
-          <w:sz w:val="20"/>
-          <w:szCs w:val="20"/>
-        </w:rPr>
-        <w:t>2017 – Present</w:t>
-      </w:r>
-    </w:p>
-    <w:p>
-      <w:pPr>
-        <w:pStyle w:val="ListParagraph"/>
-        <w:numPr>
-          <w:ilvl w:val="0"/>
-          <w:numId w:val="20"/>
-        </w:numPr>
-        <w:spacing w:after="0" w:line="240" w:lineRule="auto"/>
-        <w:rPr>
-          <w:sz w:val="20"/>
-          <w:szCs w:val="20"/>
-        </w:rPr>
-      </w:pPr>
-      <w:r>
-        <w:rPr>
-          <w:sz w:val="20"/>
-          <w:szCs w:val="20"/>
-        </w:rPr>
-        <w:t>Leading and mentoring student groups (grades 9–12) across multiple annual Ullas programs.</w:t>
-      </w:r>
-    </w:p>
-    <w:p>
-      <w:pPr>
-        <w:pStyle w:val="ListParagraph"/>
-        <w:numPr>
-          <w:ilvl w:val="0"/>
-          <w:numId w:val="20"/>
-        </w:numPr>
-        <w:spacing w:after="0" w:line="240" w:lineRule="auto"/>
-        <w:rPr>
-          <w:sz w:val="20"/>
-          <w:szCs w:val="20"/>
-        </w:rPr>
-      </w:pPr>
-      <w:r>
-        <w:rPr>
-          <w:sz w:val="20"/>
-          <w:szCs w:val="20"/>
-        </w:rPr>
-        <w:t>Guiding students through personal development, emotional wellness, discipline, and academic growth.</w:t>
-      </w:r>
-    </w:p>
-    <w:p>
-      <w:pPr>
-        <w:pStyle w:val="ListParagraph"/>
-        <w:numPr>
-          <w:ilvl w:val="0"/>
-          <w:numId w:val="20"/>
-        </w:numPr>
-        <w:spacing w:after="0" w:line="240" w:lineRule="auto"/>
-        <w:rPr>
-          <w:sz w:val="20"/>
-          <w:szCs w:val="20"/>
-        </w:rPr>
-      </w:pPr>
-      <w:r>
-        <w:rPr>
-          <w:sz w:val="20"/>
-          <w:szCs w:val="20"/>
-        </w:rPr>
-        <w:t>Coordinating volunteer teams during workshops, events, and recognition programs.</w:t>
-      </w:r>
-    </w:p>
-    <w:p>
-      <w:pPr>
-        <w:pStyle w:val="ListParagraph"/>
-        <w:numPr>
-          <w:ilvl w:val="0"/>
-          <w:numId w:val="20"/>
-        </w:numPr>
-        <w:spacing w:after="0" w:line="240" w:lineRule="auto"/>
-        <w:rPr>
-          <w:sz w:val="20"/>
-          <w:szCs w:val="20"/>
-        </w:rPr>
-      </w:pPr>
-      <w:r>
-        <w:rPr>
-          <w:sz w:val="20"/>
-          <w:szCs w:val="20"/>
-        </w:rPr>
-        <w:t>Supporting Ullas Trust’s mission of empowering students from under-resourced communities.</w:t>
-      </w:r>
-    </w:p>
-    <w:p>
-      <w:pPr>
-        <w:pStyle w:val="ListParagraph"/>
-        <w:spacing w:after="0" w:line="240" w:lineRule="auto"/>
-        <w:rPr>
-          <w:sz w:val="20"/>
-          <w:szCs w:val="20"/>
-        </w:rPr>
-      </w:pPr>
-    </w:p>
-    <w:p>
-      <w:pPr>
-        <w:spacing w:after="0" w:line="240" w:lineRule="auto"/>
-        <w:rPr>
-          <w:b/>
-          <w:bCs/>
-          <w:sz w:val="20"/>
-          <w:szCs w:val="20"/>
-        </w:rPr>
-      </w:pPr>
-      <w:r>
-        <w:rPr>
-          <w:b/>
-          <w:bCs/>
-          <w:sz w:val="20"/>
-          <w:szCs w:val="20"/>
-        </w:rPr>
-        <w:t>ACHIEVEMENTS</w:t>
-      </w:r>
-    </w:p>
-    <w:p>
-      <w:pPr>
-        <w:spacing w:after="0" w:line="240" w:lineRule="auto"/>
-        <w:ind w:firstLine="360"/>
-        <w:rPr>
-          <w:sz w:val="18"/>
-          <w:szCs w:val="18"/>
-        </w:rPr>
-      </w:pPr>
-      <w:r>
-        <w:rPr>
-          <w:sz w:val="18"/>
-          <w:szCs w:val="18"/>
-        </w:rPr>
-        <w:t xml:space="preserve"> </w:t>
-      </w:r>
-      <w:r>
-        <w:rPr>
-          <w:b/>
-          <w:bCs/>
-          <w:sz w:val="18"/>
-          <w:szCs w:val="18"/>
-        </w:rPr>
-        <w:t>Finalist – IBM Hackathon | Dehradun, 2023</w:t>
+        <w:t>CERTIFICATIONS</w:t>
       </w:r>
     </w:p>
     <w:p>
@@ -1926,16 +2782,34 @@
         </w:numPr>
         <w:spacing w:after="0" w:line="240" w:lineRule="auto"/>
         <w:rPr>
-          <w:sz w:val="18"/>
-          <w:szCs w:val="18"/>
-        </w:rPr>
-      </w:pPr>
-      <w:r>
-        <w:rPr>
-          <w:sz w:val="18"/>
-          <w:szCs w:val="18"/>
-        </w:rPr>
-        <w:t>Developed an ML-based platform to detect abusive content using Python, TensorFlow, and NLP</w:t>
+          <w:b/>
+          <w:bCs/>
+          <w:sz w:val="18"/>
+          <w:szCs w:val="18"/>
+        </w:rPr>
+      </w:pPr>
+      <w:r>
+        <w:rPr>
+          <w:b/>
+          <w:bCs/>
+          <w:sz w:val="18"/>
+          <w:szCs w:val="18"/>
+        </w:rPr>
+        <w:t>Building GenAI Applications with MongoDB</w:t>
+      </w:r>
+      <w:r>
+        <w:rPr>
+          <w:sz w:val="18"/>
+          <w:szCs w:val="18"/>
+        </w:rPr>
+        <w:t xml:space="preserve"> — MongoDB</w:t>
+      </w:r>
+      <w:r>
+        <w:rPr>
+          <w:sz w:val="18"/>
+          <w:szCs w:val="18"/>
+        </w:rPr>
+        <w:t>.</w:t>
       </w:r>
       <w:r>
         <w:rPr>
@@ -1949,33 +2823,60 @@
           <w:sz w:val="18"/>
           <w:szCs w:val="18"/>
         </w:rPr>
-        <w:t>Built a real-time moderation system to flag offensive text</w:t>
-      </w:r>
-    </w:p>
-    <w:p>
-      <w:pPr>
-        <w:spacing w:after="0" w:line="240" w:lineRule="auto"/>
-        <w:ind w:firstLine="360"/>
-        <w:rPr>
-          <w:sz w:val="18"/>
-          <w:szCs w:val="18"/>
-        </w:rPr>
-      </w:pPr>
-      <w:r>
-        <w:rPr>
-          <w:sz w:val="18"/>
-          <w:szCs w:val="18"/>
-        </w:rPr>
-        <w:t xml:space="preserve"> </w:t>
-      </w:r>
-      <w:r>
-        <w:rPr>
-          <w:b/>
-          <w:bCs/>
-          <w:sz w:val="18"/>
-          <w:szCs w:val="18"/>
-        </w:rPr>
-        <w:t>3rd Place – IBM ICE DAY | Starex University, Gurugram, 2022</w:t>
+        <w:tab/>
+      </w:r>
+      <w:r>
+        <w:rPr>
+          <w:sz w:val="18"/>
+          <w:szCs w:val="18"/>
+        </w:rPr>
+        <w:tab/>
+      </w:r>
+      <w:r>
+        <w:rPr>
+          <w:sz w:val="18"/>
+          <w:szCs w:val="18"/>
+        </w:rPr>
+        <w:tab/>
+      </w:r>
+      <w:r>
+        <w:rPr>
+          <w:sz w:val="18"/>
+          <w:szCs w:val="18"/>
+        </w:rPr>
+        <w:tab/>
+      </w:r>
+      <w:r>
+        <w:rPr>
+          <w:sz w:val="18"/>
+          <w:szCs w:val="18"/>
+        </w:rPr>
+        <w:tab/>
+      </w:r>
+      <w:r>
+        <w:rPr>
+          <w:sz w:val="18"/>
+          <w:szCs w:val="18"/>
+        </w:rPr>
+        <w:tab/>
+      </w:r>
+      <w:r>
+        <w:rPr>
+          <w:b/>
+          <w:bCs/>
+          <w:sz w:val="18"/>
+          <w:szCs w:val="18"/>
+        </w:rPr>
+        <w:t>December</w:t>
+      </w:r>
+      <w:r>
+        <w:rPr>
+          <w:b/>
+          <w:bCs/>
+          <w:sz w:val="18"/>
+          <w:szCs w:val="18"/>
+        </w:rPr>
+        <w:t xml:space="preserve"> 2025</w:t>
       </w:r>
     </w:p>
     <w:p>
@@ -1987,45 +2888,78 @@
         </w:numPr>
         <w:spacing w:after="0" w:line="240" w:lineRule="auto"/>
         <w:rPr>
-          <w:sz w:val="20"/>
-          <w:szCs w:val="20"/>
-        </w:rPr>
-      </w:pPr>
-      <w:r>
-        <w:rPr>
-          <w:sz w:val="20"/>
-          <w:szCs w:val="20"/>
-        </w:rPr>
-        <w:t>Known for strong communication, research, and presentation skills in a competitive presentation event.</w:t>
-      </w:r>
-    </w:p>
-    <w:p>
-      <w:pPr>
-        <w:pStyle w:val="ListParagraph"/>
-        <w:spacing w:after="0" w:line="240" w:lineRule="auto"/>
-        <w:ind w:left="1080"/>
-        <w:rPr>
-          <w:sz w:val="20"/>
-          <w:szCs w:val="20"/>
-        </w:rPr>
-      </w:pPr>
-    </w:p>
-    <w:p>
-      <w:pPr>
-        <w:spacing w:after="0" w:line="240" w:lineRule="auto"/>
-        <w:rPr>
-          <w:sz w:val="18"/>
-          <w:szCs w:val="18"/>
-        </w:rPr>
-      </w:pPr>
-      <w:r>
-        <w:rPr>
-          <w:b/>
-          <w:bCs/>
-          <w:sz w:val="20"/>
-          <w:szCs w:val="20"/>
-        </w:rPr>
-        <w:t>EDUCATION</w:t>
+          <w:sz w:val="18"/>
+          <w:szCs w:val="18"/>
+        </w:rPr>
+      </w:pPr>
+      <w:r>
+        <w:rPr>
+          <w:b/>
+          <w:bCs/>
+          <w:sz w:val="18"/>
+          <w:szCs w:val="18"/>
+        </w:rPr>
+        <w:t>MongoDB Schema Design Patterns and Anti-patterns</w:t>
+      </w:r>
+      <w:r>
+        <w:rPr>
+          <w:sz w:val="18"/>
+          <w:szCs w:val="18"/>
+        </w:rPr>
+        <w:t xml:space="preserve"> — MongoDB </w:t>
+      </w:r>
+      <w:r>
+        <w:rPr>
+          <w:sz w:val="18"/>
+          <w:szCs w:val="18"/>
+        </w:rPr>
+        <w:tab/>
+      </w:r>
+      <w:r>
+        <w:rPr>
+          <w:sz w:val="18"/>
+          <w:szCs w:val="18"/>
+        </w:rPr>
+        <w:tab/>
+      </w:r>
+      <w:r>
+        <w:rPr>
+          <w:sz w:val="18"/>
+          <w:szCs w:val="18"/>
+        </w:rPr>
+        <w:tab/>
+      </w:r>
+      <w:r>
+        <w:rPr>
+          <w:sz w:val="18"/>
+          <w:szCs w:val="18"/>
+        </w:rPr>
+        <w:tab/>
+      </w:r>
+      <w:r>
+        <w:rPr>
+          <w:sz w:val="18"/>
+          <w:szCs w:val="18"/>
+        </w:rPr>
+        <w:tab/>
+      </w:r>
+      <w:r>
+        <w:rPr>
+          <w:b/>
+          <w:bCs/>
+          <w:sz w:val="18"/>
+          <w:szCs w:val="18"/>
+        </w:rPr>
+        <w:t>December</w:t>
+      </w:r>
+      <w:r>
+        <w:rPr>
+          <w:b/>
+          <w:bCs/>
+          <w:sz w:val="18"/>
+          <w:szCs w:val="18"/>
+        </w:rPr>
+        <w:t xml:space="preserve"> 2025</w:t>
       </w:r>
     </w:p>
     <w:p>
@@ -2043,38 +2977,160 @@
       </w:pPr>
       <w:r>
         <w:rPr>
-          <w:sz w:val="18"/>
-          <w:szCs w:val="18"/>
-        </w:rPr>
-        <w:t>Bachelor of Technology (B. Tech) in Computer Science</w:t>
-      </w:r>
-      <w:r>
-        <w:rPr>
-          <w:sz w:val="18"/>
-          <w:szCs w:val="18"/>
-        </w:rPr>
-        <w:t xml:space="preserve">, </w:t>
-      </w:r>
-      <w:r>
-        <w:rPr>
-          <w:sz w:val="18"/>
-          <w:szCs w:val="18"/>
-        </w:rPr>
-        <w:t>Starex University, G</w:t>
-      </w:r>
-      <w:r>
-        <w:rPr>
-          <w:sz w:val="18"/>
-          <w:szCs w:val="18"/>
-        </w:rPr>
-        <w:t>urugram</w:t>
-      </w:r>
-      <w:r>
-        <w:rPr>
-          <w:sz w:val="18"/>
-          <w:szCs w:val="18"/>
-        </w:rPr>
-        <w:t xml:space="preserve">, Haryana | 2021 - 2025 | CGPA: 7.49 </w:t>
+          <w:b/>
+          <w:bCs/>
+          <w:sz w:val="18"/>
+          <w:szCs w:val="18"/>
+        </w:rPr>
+        <w:t>Artificial Intelligence &amp; Machine Learning</w:t>
+      </w:r>
+      <w:r>
+        <w:rPr>
+          <w:sz w:val="18"/>
+          <w:szCs w:val="18"/>
+        </w:rPr>
+        <w:t xml:space="preserve"> — IBM Innovation Centre for Education | Graduate (4-Star)</w:t>
+      </w:r>
+      <w:r>
+        <w:rPr>
+          <w:sz w:val="18"/>
+          <w:szCs w:val="18"/>
+        </w:rPr>
+        <w:tab/>
+      </w:r>
+      <w:r>
+        <w:rPr>
+          <w:sz w:val="18"/>
+          <w:szCs w:val="18"/>
+        </w:rPr>
+        <w:tab/>
+      </w:r>
+      <w:r>
+        <w:rPr>
+          <w:rStyle w:val="Emphasis"/>
+          <w:rFonts w:cstheme="minorHAnsi"/>
+          <w:b/>
+          <w:bCs/>
+          <w:i w:val="0"/>
+          <w:iCs w:val="0"/>
+          <w:sz w:val="18"/>
+          <w:szCs w:val="18"/>
+        </w:rPr>
+        <w:t>Nov</w:t>
+      </w:r>
+      <w:r>
+        <w:rPr>
+          <w:rStyle w:val="Emphasis"/>
+          <w:rFonts w:cstheme="minorHAnsi"/>
+          <w:b/>
+          <w:bCs/>
+          <w:i w:val="0"/>
+          <w:iCs w:val="0"/>
+          <w:sz w:val="18"/>
+          <w:szCs w:val="18"/>
+        </w:rPr>
+        <w:t xml:space="preserve"> 202</w:t>
+      </w:r>
+      <w:r>
+        <w:rPr>
+          <w:rStyle w:val="Emphasis"/>
+          <w:rFonts w:cstheme="minorHAnsi"/>
+          <w:b/>
+          <w:bCs/>
+          <w:i w:val="0"/>
+          <w:iCs w:val="0"/>
+          <w:sz w:val="18"/>
+          <w:szCs w:val="18"/>
+        </w:rPr>
+        <w:t>1</w:t>
+      </w:r>
+      <w:r>
+        <w:rPr>
+          <w:rStyle w:val="Emphasis"/>
+          <w:rFonts w:cstheme="minorHAnsi"/>
+          <w:b/>
+          <w:bCs/>
+          <w:i w:val="0"/>
+          <w:iCs w:val="0"/>
+          <w:sz w:val="18"/>
+          <w:szCs w:val="18"/>
+        </w:rPr>
+        <w:t xml:space="preserve"> – </w:t>
+      </w:r>
+      <w:r>
+        <w:rPr>
+          <w:rStyle w:val="Emphasis"/>
+          <w:rFonts w:cstheme="minorHAnsi"/>
+          <w:b/>
+          <w:bCs/>
+          <w:i w:val="0"/>
+          <w:iCs w:val="0"/>
+          <w:sz w:val="18"/>
+          <w:szCs w:val="18"/>
+        </w:rPr>
+        <w:t>May</w:t>
+      </w:r>
+      <w:r>
+        <w:rPr>
+          <w:rStyle w:val="Emphasis"/>
+          <w:rFonts w:cstheme="minorHAnsi"/>
+          <w:b/>
+          <w:bCs/>
+          <w:i w:val="0"/>
+          <w:iCs w:val="0"/>
+          <w:sz w:val="18"/>
+          <w:szCs w:val="18"/>
+        </w:rPr>
+        <w:t xml:space="preserve"> 202</w:t>
+      </w:r>
+      <w:r>
+        <w:rPr>
+          <w:rStyle w:val="Emphasis"/>
+          <w:rFonts w:cstheme="minorHAnsi"/>
+          <w:b/>
+          <w:bCs/>
+          <w:i w:val="0"/>
+          <w:iCs w:val="0"/>
+          <w:sz w:val="18"/>
+          <w:szCs w:val="18"/>
+        </w:rPr>
+        <w:t>5</w:t>
+      </w:r>
+      <w:r>
+        <w:rPr>
+          <w:sz w:val="16"/>
+          <w:szCs w:val="16"/>
+        </w:rPr>
+        <w:t xml:space="preserve"> </w:t>
+      </w:r>
+    </w:p>
+    <w:p>
+      <w:pPr>
+        <w:spacing w:after="0" w:line="240" w:lineRule="auto"/>
+        <w:rPr>
+          <w:b/>
+          <w:bCs/>
+          <w:sz w:val="20"/>
+          <w:szCs w:val="20"/>
+        </w:rPr>
+      </w:pPr>
+    </w:p>
+    <w:p>
+      <w:pPr>
+        <w:spacing w:after="0" w:line="240" w:lineRule="auto"/>
+        <w:rPr>
+          <w:sz w:val="20"/>
+          <w:szCs w:val="20"/>
+        </w:rPr>
+      </w:pPr>
+      <w:r>
+        <w:rPr>
+          <w:b/>
+          <w:bCs/>
+          <w:sz w:val="22"/>
+          <w:szCs w:val="22"/>
+        </w:rPr>
+        <w:t>EDUCATION</w:t>
       </w:r>
     </w:p>
     <w:p>
@@ -2092,10 +3148,51 @@
       </w:pPr>
       <w:r>
         <w:rPr>
-          <w:sz w:val="18"/>
-          <w:szCs w:val="18"/>
-        </w:rPr>
-        <w:t>Higher Secondary (XII) at GMSSS, Gurugram, Haryana | 2020 - 2021 | Percentage: 87.60%</w:t>
+          <w:b/>
+          <w:bCs/>
+          <w:sz w:val="18"/>
+          <w:szCs w:val="18"/>
+        </w:rPr>
+        <w:t>B. Tech</w:t>
+      </w:r>
+      <w:r>
+        <w:rPr>
+          <w:b/>
+          <w:bCs/>
+          <w:sz w:val="18"/>
+          <w:szCs w:val="18"/>
+        </w:rPr>
+        <w:t xml:space="preserve"> </w:t>
+      </w:r>
+      <w:r>
+        <w:rPr>
+          <w:b/>
+          <w:bCs/>
+          <w:sz w:val="18"/>
+          <w:szCs w:val="18"/>
+        </w:rPr>
+        <w:t>in Computer Science</w:t>
+      </w:r>
+      <w:r>
+        <w:rPr>
+          <w:sz w:val="18"/>
+          <w:szCs w:val="18"/>
+        </w:rPr>
+        <w:t xml:space="preserve"> - </w:t>
+      </w:r>
+      <w:r>
+        <w:rPr>
+          <w:sz w:val="18"/>
+          <w:szCs w:val="18"/>
+        </w:rPr>
+        <w:t>Starex University, G</w:t>
+      </w:r>
+      <w:r>
+        <w:rPr>
+          <w:sz w:val="18"/>
+          <w:szCs w:val="18"/>
+        </w:rPr>
+        <w:t>urugram</w:t>
       </w:r>
       <w:r>
         <w:rPr>
@@ -2103,6 +3200,57 @@
           <w:szCs w:val="18"/>
         </w:rPr>
         <w:tab/>
+      </w:r>
+      <w:r>
+        <w:rPr>
+          <w:sz w:val="18"/>
+          <w:szCs w:val="18"/>
+        </w:rPr>
+        <w:tab/>
+      </w:r>
+      <w:r>
+        <w:rPr>
+          <w:sz w:val="18"/>
+          <w:szCs w:val="18"/>
+        </w:rPr>
+        <w:tab/>
+      </w:r>
+      <w:r>
+        <w:rPr>
+          <w:sz w:val="18"/>
+          <w:szCs w:val="18"/>
+        </w:rPr>
+        <w:tab/>
+      </w:r>
+      <w:r>
+        <w:rPr>
+          <w:sz w:val="18"/>
+          <w:szCs w:val="18"/>
+        </w:rPr>
+        <w:tab/>
+      </w:r>
+      <w:r>
+        <w:rPr>
+          <w:sz w:val="18"/>
+          <w:szCs w:val="18"/>
+        </w:rPr>
+        <w:tab/>
+      </w:r>
+      <w:r>
+        <w:rPr>
+          <w:b/>
+          <w:bCs/>
+          <w:sz w:val="18"/>
+          <w:szCs w:val="18"/>
+        </w:rPr>
+        <w:t>2021 - 2025 | CGPA: 7.49</w:t>
+      </w:r>
+      <w:r>
+        <w:rPr>
+          <w:sz w:val="18"/>
+          <w:szCs w:val="18"/>
+        </w:rPr>
+        <w:t xml:space="preserve"> </w:t>
       </w:r>
     </w:p>
     <w:p>
@@ -2114,16 +3262,252 @@
         </w:numPr>
         <w:spacing w:after="0" w:line="240" w:lineRule="auto"/>
         <w:rPr>
-          <w:sz w:val="20"/>
-          <w:szCs w:val="20"/>
-        </w:rPr>
-      </w:pPr>
-      <w:r>
-        <w:rPr>
-          <w:sz w:val="18"/>
-          <w:szCs w:val="18"/>
-        </w:rPr>
-        <w:t>Secondary (X) at GMSSS, Gurugram, Haryana | 2018 - 2019 | Percentage: 70%</w:t>
+          <w:sz w:val="18"/>
+          <w:szCs w:val="18"/>
+        </w:rPr>
+      </w:pPr>
+      <w:r>
+        <w:rPr>
+          <w:b/>
+          <w:bCs/>
+          <w:sz w:val="18"/>
+          <w:szCs w:val="18"/>
+        </w:rPr>
+        <w:t>Higher Secondary (XII)</w:t>
+      </w:r>
+      <w:r>
+        <w:rPr>
+          <w:sz w:val="18"/>
+          <w:szCs w:val="18"/>
+        </w:rPr>
+        <w:t xml:space="preserve"> </w:t>
+      </w:r>
+      <w:r>
+        <w:rPr>
+          <w:sz w:val="18"/>
+          <w:szCs w:val="18"/>
+        </w:rPr>
+        <w:t xml:space="preserve">- </w:t>
+      </w:r>
+      <w:r>
+        <w:rPr>
+          <w:sz w:val="18"/>
+          <w:szCs w:val="18"/>
+        </w:rPr>
+        <w:t>GMSSS</w:t>
+      </w:r>
+      <w:r>
+        <w:rPr>
+          <w:sz w:val="18"/>
+          <w:szCs w:val="18"/>
+        </w:rPr>
+        <w:t xml:space="preserve">, Gurugram </w:t>
+      </w:r>
+      <w:r>
+        <w:rPr>
+          <w:sz w:val="18"/>
+          <w:szCs w:val="18"/>
+        </w:rPr>
+        <w:tab/>
+      </w:r>
+      <w:r>
+        <w:rPr>
+          <w:sz w:val="18"/>
+          <w:szCs w:val="18"/>
+        </w:rPr>
+        <w:tab/>
+      </w:r>
+      <w:r>
+        <w:rPr>
+          <w:sz w:val="18"/>
+          <w:szCs w:val="18"/>
+        </w:rPr>
+        <w:tab/>
+      </w:r>
+      <w:r>
+        <w:rPr>
+          <w:sz w:val="18"/>
+          <w:szCs w:val="18"/>
+        </w:rPr>
+        <w:tab/>
+      </w:r>
+      <w:r>
+        <w:rPr>
+          <w:sz w:val="18"/>
+          <w:szCs w:val="18"/>
+        </w:rPr>
+        <w:tab/>
+      </w:r>
+      <w:r>
+        <w:rPr>
+          <w:sz w:val="18"/>
+          <w:szCs w:val="18"/>
+        </w:rPr>
+        <w:tab/>
+      </w:r>
+      <w:r>
+        <w:rPr>
+          <w:sz w:val="18"/>
+          <w:szCs w:val="18"/>
+        </w:rPr>
+        <w:tab/>
+      </w:r>
+      <w:r>
+        <w:rPr>
+          <w:sz w:val="18"/>
+          <w:szCs w:val="18"/>
+        </w:rPr>
+        <w:tab/>
+      </w:r>
+      <w:r>
+        <w:rPr>
+          <w:b/>
+          <w:bCs/>
+          <w:sz w:val="18"/>
+          <w:szCs w:val="18"/>
+        </w:rPr>
+        <w:t>2020 - 2021 |</w:t>
+      </w:r>
+      <w:r>
+        <w:rPr>
+          <w:b/>
+          <w:bCs/>
+          <w:sz w:val="18"/>
+          <w:szCs w:val="18"/>
+        </w:rPr>
+        <w:t xml:space="preserve"> </w:t>
+      </w:r>
+      <w:r>
+        <w:rPr>
+          <w:b/>
+          <w:bCs/>
+          <w:sz w:val="18"/>
+          <w:szCs w:val="18"/>
+        </w:rPr>
+        <w:t>87.60%</w:t>
+      </w:r>
+    </w:p>
+    <w:p>
+      <w:pPr>
+        <w:pStyle w:val="ListParagraph"/>
+        <w:numPr>
+          <w:ilvl w:val="0"/>
+          <w:numId w:val="18"/>
+        </w:numPr>
+        <w:spacing w:after="0" w:line="240" w:lineRule="auto"/>
+        <w:rPr>
+          <w:sz w:val="20"/>
+          <w:szCs w:val="20"/>
+        </w:rPr>
+      </w:pPr>
+      <w:r>
+        <w:rPr>
+          <w:b/>
+          <w:bCs/>
+          <w:sz w:val="18"/>
+          <w:szCs w:val="18"/>
+        </w:rPr>
+        <w:t>Secondary (X)</w:t>
+      </w:r>
+      <w:r>
+        <w:rPr>
+          <w:sz w:val="18"/>
+          <w:szCs w:val="18"/>
+        </w:rPr>
+        <w:t xml:space="preserve"> </w:t>
+      </w:r>
+      <w:r>
+        <w:rPr>
+          <w:sz w:val="18"/>
+          <w:szCs w:val="18"/>
+        </w:rPr>
+        <w:t>-</w:t>
+      </w:r>
+      <w:r>
+        <w:rPr>
+          <w:sz w:val="18"/>
+          <w:szCs w:val="18"/>
+        </w:rPr>
+        <w:t xml:space="preserve"> </w:t>
+      </w:r>
+      <w:r>
+        <w:rPr>
+          <w:sz w:val="18"/>
+          <w:szCs w:val="18"/>
+        </w:rPr>
+        <w:t>GMSSS</w:t>
+      </w:r>
+      <w:r>
+        <w:rPr>
+          <w:sz w:val="18"/>
+          <w:szCs w:val="18"/>
+        </w:rPr>
+        <w:t xml:space="preserve">, Gurugram, </w:t>
+      </w:r>
+      <w:r>
+        <w:rPr>
+          <w:sz w:val="18"/>
+          <w:szCs w:val="18"/>
+        </w:rPr>
+        <w:tab/>
+      </w:r>
+      <w:r>
+        <w:rPr>
+          <w:sz w:val="18"/>
+          <w:szCs w:val="18"/>
+        </w:rPr>
+        <w:tab/>
+      </w:r>
+      <w:r>
+        <w:rPr>
+          <w:sz w:val="18"/>
+          <w:szCs w:val="18"/>
+        </w:rPr>
+        <w:tab/>
+      </w:r>
+      <w:r>
+        <w:rPr>
+          <w:sz w:val="18"/>
+          <w:szCs w:val="18"/>
+        </w:rPr>
+        <w:tab/>
+      </w:r>
+      <w:r>
+        <w:rPr>
+          <w:sz w:val="18"/>
+          <w:szCs w:val="18"/>
+        </w:rPr>
+        <w:tab/>
+      </w:r>
+      <w:r>
+        <w:rPr>
+          <w:sz w:val="18"/>
+          <w:szCs w:val="18"/>
+        </w:rPr>
+        <w:tab/>
+      </w:r>
+      <w:r>
+        <w:rPr>
+          <w:sz w:val="18"/>
+          <w:szCs w:val="18"/>
+        </w:rPr>
+        <w:tab/>
+      </w:r>
+      <w:r>
+        <w:rPr>
+          <w:sz w:val="18"/>
+          <w:szCs w:val="18"/>
+        </w:rPr>
+        <w:tab/>
+      </w:r>
+      <w:r>
+        <w:rPr>
+          <w:b/>
+          <w:bCs/>
+          <w:sz w:val="18"/>
+          <w:szCs w:val="18"/>
+        </w:rPr>
+        <w:t>2018 - 2019 | 70%</w:t>
       </w:r>
       <w:r>
         <w:rPr>
@@ -5084,7 +6468,7 @@
   <w:style w:type="paragraph" w:default="1" w:styleId="Normal">
     <w:name w:val="Normal"/>
     <w:qFormat/>
-    <w:rsid w:val="00EC2FD9"/>
+    <w:rsid w:val="00651E76"/>
   </w:style>
   <w:style w:type="paragraph" w:styleId="Heading1">
     <w:name w:val="heading 1"/>

</xml_diff>